<commit_message>
Make the documentation portable rather than site-specific
The docs described one lab's filesystem: absolute paths under a named home
directory, cohort-specific results folders, an SMB share, and Slurm job numbers
that mean nothing outside that cluster. Two links pointed at a directory that
is not in the repository, so they were broken for every reader.

Everything site-specific is now a placeholder or an environment variable, the
result-folder tables describe the two pipeline variants instead of naming local
directories, and study references point at public resources. Behaviour is
unchanged: the executable defaults in subject.sh and friends still resolve
locally, since only prose was generalised.

Co-authored-by: Cursor <cursoragent@cursor.com>
</commit_message>
<xml_diff>
--- a/dwi_pipeline/DWI_Connectivity_Pipeline_Documentation.docx
+++ b/dwi_pipeline/DWI_Connectivity_Pipeline_Documentation.docx
@@ -11,6 +11,14 @@
       </w:r>
     </w:p>
     <w:p>
+      <w:r>
+        <w:rPr>
+          <w:i/>
+        </w:rPr>
+        <w:t>Last updated: July 2026 — reflects strict fail-fast pipeline, default dwi-select (b1000), and separated result folders.</w:t>
+      </w:r>
+    </w:p>
+    <w:p>
       <w:pPr>
         <w:pStyle w:val="Heading2"/>
       </w:pPr>
@@ -20,7 +28,43 @@
     </w:p>
     <w:p>
       <w:r>
-        <w:t>This pipeline generates diffusion MRI tractography and connectome outputs using QSIPrep, FreeSurfer/FastSurfer, QSIRecon, and a post-hoc Desikan–Killiany (DK) connectome step.</w:t>
+        <w:t xml:space="preserve">This pipeline generates diffusion MRI tractography and connectome outputs using </w:t>
+      </w:r>
+      <w:r>
+        <w:rPr>
+          <w:b/>
+        </w:rPr>
+        <w:t>QSIPrep</w:t>
+      </w:r>
+      <w:r>
+        <w:t xml:space="preserve">, </w:t>
+      </w:r>
+      <w:r>
+        <w:rPr>
+          <w:b/>
+        </w:rPr>
+        <w:t>FreeSurfer/FastSurfer</w:t>
+      </w:r>
+      <w:r>
+        <w:t xml:space="preserve">, </w:t>
+      </w:r>
+      <w:r>
+        <w:rPr>
+          <w:b/>
+        </w:rPr>
+        <w:t>QSIRecon</w:t>
+      </w:r>
+      <w:r>
+        <w:t xml:space="preserve">, and an optional post-hoc </w:t>
+      </w:r>
+      <w:r>
+        <w:rPr>
+          <w:b/>
+        </w:rPr>
+        <w:t>Desikan–Killiany (DK) connectome</w:t>
+      </w:r>
+      <w:r>
+        <w:t xml:space="preserve"> step.</w:t>
       </w:r>
     </w:p>
     <w:p>
@@ -33,7 +77,22 @@
         <w:pStyle w:val="ListNumber"/>
       </w:pPr>
       <w:r>
-        <w:t>**QSIPrep** — preprocesses DWI data and defines the tracking space.</w:t>
+        <w:rPr>
+          <w:b/>
+        </w:rPr>
+        <w:t>QSIPrep</w:t>
+      </w:r>
+      <w:r>
+        <w:t xml:space="preserve"> — preprocesses DWI data (with </w:t>
+      </w:r>
+      <w:r>
+        <w:rPr>
+          <w:b/>
+        </w:rPr>
+        <w:t>dwi-select</w:t>
+      </w:r>
+      <w:r>
+        <w:t xml:space="preserve"> series filtering by default) and defines the tracking space.</w:t>
       </w:r>
     </w:p>
     <w:p>
@@ -41,7 +100,13 @@
         <w:pStyle w:val="ListNumber"/>
       </w:pPr>
       <w:r>
-        <w:t>**FreeSurfer or FastSurfer** — generates anatomical parcellations from the T1w image.</w:t>
+        <w:rPr>
+          <w:b/>
+        </w:rPr>
+        <w:t>FreeSurfer or FastSurfer</w:t>
+      </w:r>
+      <w:r>
+        <w:t xml:space="preserve"> — generates anatomical parcellations from the T1w image.</w:t>
       </w:r>
     </w:p>
     <w:p>
@@ -49,7 +114,13 @@
         <w:pStyle w:val="ListNumber"/>
       </w:pPr>
       <w:r>
-        <w:t>**QSIRecon** — reconstructs diffusion models, runs tractography, and optionally creates an atlas-based connectome.</w:t>
+        <w:rPr>
+          <w:b/>
+        </w:rPr>
+        <w:t>QSIRecon</w:t>
+      </w:r>
+      <w:r>
+        <w:t xml:space="preserve"> — reconstructs diffusion models, runs tractography, and optionally creates an atlas-based connectome (4S156).</w:t>
       </w:r>
     </w:p>
     <w:p>
@@ -57,14 +128,631 @@
         <w:pStyle w:val="ListNumber"/>
       </w:pPr>
       <w:r>
-        <w:t>**DK connectome** — warps FreeSurfer labels into QSIPrep space and generates a DK-based connectome.</w:t>
+        <w:rPr>
+          <w:b/>
+        </w:rPr>
+        <w:t>DK connectome</w:t>
+      </w:r>
+      <w:r>
+        <w:t xml:space="preserve"> (optional) — warps FreeSurfer labels into QSIPrep space and generates an 84-region DK matrix.</w:t>
       </w:r>
     </w:p>
     <w:p>
       <w:r>
-        <w:t>Tractography and the DK connectome both live in QSIPrep T1w space. FreeSurfer supplies anatomical region labels; those labels are aligned to the tractography grid before connections are counted.</w:t>
+        <w:t xml:space="preserve">Tractography and the DK connectome both live in </w:t>
+      </w:r>
+      <w:r>
+        <w:rPr>
+          <w:b/>
+        </w:rPr>
+        <w:t>QSIPrep T1w / dwiref space</w:t>
+      </w:r>
+      <w:r>
+        <w:t>. FreeSurfer supplies anatomical region labels; those labels are aligned to the tractography grid before connections are counted.</w:t>
       </w:r>
     </w:p>
+    <w:p/>
+    <w:p>
+      <w:pPr>
+        <w:pStyle w:val="Heading2"/>
+      </w:pPr>
+      <w:r>
+        <w:t>Pipeline variants and result folders</w:t>
+      </w:r>
+    </w:p>
+    <w:tbl>
+      <w:tblPr>
+        <w:tblStyle w:val="TableGrid"/>
+        <w:tblW w:type="auto" w:w="0"/>
+        <w:tblLook w:firstColumn="1" w:firstRow="1" w:lastColumn="0" w:lastRow="0" w:noHBand="0" w:noVBand="1" w:val="04A0"/>
+      </w:tblPr>
+      <w:tblGrid>
+        <w:gridCol w:w="2880"/>
+        <w:gridCol w:w="2880"/>
+        <w:gridCol w:w="2880"/>
+      </w:tblGrid>
+      <w:tr>
+        <w:tc>
+          <w:tcPr>
+            <w:tcW w:type="dxa" w:w="2880"/>
+          </w:tcPr>
+          <w:p>
+            <w:r>
+              <w:t>Variant</w:t>
+            </w:r>
+          </w:p>
+        </w:tc>
+        <w:tc>
+          <w:tcPr>
+            <w:tcW w:type="dxa" w:w="2880"/>
+          </w:tcPr>
+          <w:p>
+            <w:r>
+              <w:t>Wrapper / entry</w:t>
+            </w:r>
+          </w:p>
+        </w:tc>
+        <w:tc>
+          <w:tcPr>
+            <w:tcW w:type="dxa" w:w="2880"/>
+          </w:tcPr>
+          <w:p>
+            <w:r>
+              <w:t>Step 4</w:t>
+            </w:r>
+          </w:p>
+        </w:tc>
+      </w:tr>
+      <w:tr>
+        <w:tc>
+          <w:tcPr>
+            <w:tcW w:type="dxa" w:w="2880"/>
+          </w:tcPr>
+          <w:p>
+            <w:r>
+              <w:t>**Full pipeline**</w:t>
+            </w:r>
+          </w:p>
+        </w:tc>
+        <w:tc>
+          <w:tcPr>
+            <w:tcW w:type="dxa" w:w="2880"/>
+          </w:tcPr>
+          <w:p>
+            <w:r>
+              <w:t>`dwi_pipeline/subject.sh`</w:t>
+            </w:r>
+          </w:p>
+        </w:tc>
+        <w:tc>
+          <w:tcPr>
+            <w:tcW w:type="dxa" w:w="2880"/>
+          </w:tcPr>
+          <w:p>
+            <w:r>
+              <w:t>ON (`RUN_CONNECTOME=1`)</w:t>
+            </w:r>
+          </w:p>
+        </w:tc>
+      </w:tr>
+      <w:tr>
+        <w:tc>
+          <w:tcPr>
+            <w:tcW w:type="dxa" w:w="2880"/>
+          </w:tcPr>
+          <w:p>
+            <w:r>
+              <w:t>**Atlas connectome only**</w:t>
+            </w:r>
+          </w:p>
+        </w:tc>
+        <w:tc>
+          <w:tcPr>
+            <w:tcW w:type="dxa" w:w="2880"/>
+          </w:tcPr>
+          <w:p>
+            <w:r>
+              <w:t>`dwi_connect_default/subject.sh`</w:t>
+            </w:r>
+          </w:p>
+        </w:tc>
+        <w:tc>
+          <w:tcPr>
+            <w:tcW w:type="dxa" w:w="2880"/>
+          </w:tcPr>
+          <w:p>
+            <w:r>
+              <w:t>OFF (`RUN_CONNECTOME=0`)</w:t>
+            </w:r>
+          </w:p>
+        </w:tc>
+      </w:tr>
+    </w:tbl>
+    <w:p/>
+    <w:p>
+      <w:r>
+        <w:rPr>
+          <w:rFonts w:ascii="Courier New" w:hAnsi="Courier New"/>
+        </w:rPr>
+        <w:t>RESULTS_ROOT</w:t>
+      </w:r>
+      <w:r>
+        <w:t xml:space="preserve"> is yours to choose. Give each cohort its own directory so that</w:t>
+      </w:r>
+    </w:p>
+    <w:p>
+      <w:r>
+        <w:t>runs made with different settings cannot overwrite one another.</w:t>
+      </w:r>
+    </w:p>
+    <w:p>
+      <w:r>
+        <w:t>Repo docs:</w:t>
+      </w:r>
+    </w:p>
+    <w:p>
+      <w:pPr>
+        <w:pStyle w:val="ListBullet"/>
+      </w:pPr>
+      <w:r>
+        <w:rPr>
+          <w:rFonts w:ascii="Courier New" w:hAnsi="Courier New"/>
+        </w:rPr>
+        <w:t>dwi_pipeline/README.md</w:t>
+      </w:r>
+      <w:r>
+        <w:t xml:space="preserve"> — launcher reference</w:t>
+      </w:r>
+    </w:p>
+    <w:p>
+      <w:pPr>
+        <w:pStyle w:val="ListBullet"/>
+      </w:pPr>
+      <w:r>
+        <w:rPr>
+          <w:rFonts w:ascii="Courier New" w:hAnsi="Courier New"/>
+        </w:rPr>
+        <w:t>bids.md</w:t>
+      </w:r>
+      <w:r>
+        <w:t xml:space="preserve"> — PE metadata and dwi-select</w:t>
+      </w:r>
+    </w:p>
+    <w:p>
+      <w:pPr>
+        <w:pStyle w:val="ListBullet"/>
+      </w:pPr>
+      <w:r>
+        <w:rPr>
+          <w:rFonts w:ascii="Courier New" w:hAnsi="Courier New"/>
+        </w:rPr>
+        <w:t>fmaps.md</w:t>
+      </w:r>
+      <w:r>
+        <w:t xml:space="preserve"> — SDC / fieldmap behavior</w:t>
+      </w:r>
+    </w:p>
+    <w:p/>
+    <w:p>
+      <w:pPr>
+        <w:pStyle w:val="Heading2"/>
+      </w:pPr>
+      <w:r>
+        <w:t>BIDS preparation (before QSIPrep)</w:t>
+      </w:r>
+    </w:p>
+    <w:p>
+      <w:r>
+        <w:t xml:space="preserve">Sidecar repair is </w:t>
+      </w:r>
+      <w:r>
+        <w:rPr>
+          <w:b/>
+        </w:rPr>
+        <w:t>not</w:t>
+      </w:r>
+      <w:r>
+        <w:t xml:space="preserve"> run inside the pipeline. Apply fixes first:</w:t>
+      </w:r>
+    </w:p>
+    <w:p>
+      <w:r>
+        <w:rPr>
+          <w:rFonts w:ascii="Courier New" w:hAnsi="Courier New"/>
+          <w:sz w:val="18"/>
+        </w:rPr>
+        <w:t>./dwi_pipeline/scripts/run_bids_repair.sh /path/to/bids SUBJ01 --dry-run</w:t>
+        <w:br/>
+        <w:t>./dwi_pipeline/scripts/run_bids_repair.sh /path/to/bids SUBJ01</w:t>
+      </w:r>
+    </w:p>
+    <w:p>
+      <w:r>
+        <w:t xml:space="preserve">Then verify the dwi-select filter (see § dwi-select below). See </w:t>
+      </w:r>
+      <w:r>
+        <w:rPr>
+          <w:rFonts w:ascii="Courier New" w:hAnsi="Courier New"/>
+        </w:rPr>
+        <w:t>bids.md</w:t>
+      </w:r>
+      <w:r>
+        <w:t xml:space="preserve"> for TRT, </w:t>
+      </w:r>
+      <w:r>
+        <w:rPr>
+          <w:rFonts w:ascii="Courier New" w:hAnsi="Courier New"/>
+        </w:rPr>
+        <w:t>IntendedFor</w:t>
+      </w:r>
+      <w:r>
+        <w:t>, and spreadsheet-driven repair.</w:t>
+      </w:r>
+    </w:p>
+    <w:p/>
+    <w:p>
+      <w:pPr>
+        <w:pStyle w:val="Heading2"/>
+      </w:pPr>
+      <w:r>
+        <w:t>dwi-select (default ON at QSIPrep)</w:t>
+      </w:r>
+    </w:p>
+    <w:p>
+      <w:r>
+        <w:t xml:space="preserve">Config: </w:t>
+      </w:r>
+      <w:r>
+        <w:rPr>
+          <w:rFonts w:ascii="Courier New" w:hAnsi="Courier New"/>
+        </w:rPr>
+        <w:t>dwi_pipeline/config/dwi_select_b1000.json</w:t>
+      </w:r>
+      <w:r>
+        <w:t xml:space="preserve"> → per-subject QSIPrep </w:t>
+      </w:r>
+      <w:r>
+        <w:rPr>
+          <w:rFonts w:ascii="Courier New" w:hAnsi="Courier New"/>
+        </w:rPr>
+        <w:t>--bids-filter-file</w:t>
+      </w:r>
+      <w:r>
+        <w:t>.</w:t>
+      </w:r>
+    </w:p>
+    <w:tbl>
+      <w:tblPr>
+        <w:tblStyle w:val="TableGrid"/>
+        <w:tblW w:type="auto" w:w="0"/>
+        <w:tblLook w:firstColumn="1" w:firstRow="1" w:lastColumn="0" w:lastRow="0" w:noHBand="0" w:noVBand="1" w:val="04A0"/>
+      </w:tblPr>
+      <w:tblGrid>
+        <w:gridCol w:w="4320"/>
+        <w:gridCol w:w="4320"/>
+      </w:tblGrid>
+      <w:tr>
+        <w:tc>
+          <w:tcPr>
+            <w:tcW w:type="dxa" w:w="4320"/>
+          </w:tcPr>
+          <w:p>
+            <w:r>
+              <w:t>Rule</w:t>
+            </w:r>
+          </w:p>
+        </w:tc>
+        <w:tc>
+          <w:tcPr>
+            <w:tcW w:type="dxa" w:w="4320"/>
+          </w:tcPr>
+          <w:p>
+            <w:r>
+              <w:t>Behavior</w:t>
+            </w:r>
+          </w:p>
+        </w:tc>
+      </w:tr>
+      <w:tr>
+        <w:tc>
+          <w:tcPr>
+            <w:tcW w:type="dxa" w:w="4320"/>
+          </w:tcPr>
+          <w:p>
+            <w:r>
+              <w:t>DWI shell</w:t>
+            </w:r>
+          </w:p>
+        </w:tc>
+        <w:tc>
+          <w:tcPr>
+            <w:tcW w:type="dxa" w:w="4320"/>
+          </w:tcPr>
+          <w:p>
+            <w:r>
+              <w:t>Keeps series matching **b=1000** (configurable via `--dwi-shell`)</w:t>
+            </w:r>
+          </w:p>
+        </w:tc>
+      </w:tr>
+      <w:tr>
+        <w:tc>
+          <w:tcPr>
+            <w:tcW w:type="dxa" w:w="4320"/>
+          </w:tcPr>
+          <w:p>
+            <w:r>
+              <w:t>Fmap exclude</w:t>
+            </w:r>
+          </w:p>
+        </w:tc>
+        <w:tc>
+          <w:tcPr>
+            <w:tcW w:type="dxa" w:w="4320"/>
+          </w:tcPr>
+          <w:p>
+            <w:r>
+              <w:t>Skips `acq-rs` fmaps (files stay on disk; not in filter)</w:t>
+            </w:r>
+          </w:p>
+        </w:tc>
+      </w:tr>
+      <w:tr>
+        <w:tc>
+          <w:tcPr>
+            <w:tcW w:type="dxa" w:w="4320"/>
+          </w:tcPr>
+          <w:p>
+            <w:r>
+              <w:t>Fmap include</w:t>
+            </w:r>
+          </w:p>
+        </w:tc>
+        <w:tc>
+          <w:tcPr>
+            <w:tcW w:type="dxa" w:w="4320"/>
+          </w:tcPr>
+          <w:p>
+            <w:r>
+              <w:t>**IntendedFor only** — fmap kept iff it points at a kept DWI; no session fallback</w:t>
+            </w:r>
+          </w:p>
+        </w:tc>
+      </w:tr>
+      <w:tr>
+        <w:tc>
+          <w:tcPr>
+            <w:tcW w:type="dxa" w:w="4320"/>
+          </w:tcPr>
+          <w:p>
+            <w:r>
+              <w:t>Disable</w:t>
+            </w:r>
+          </w:p>
+        </w:tc>
+        <w:tc>
+          <w:tcPr>
+            <w:tcW w:type="dxa" w:w="4320"/>
+          </w:tcPr>
+          <w:p>
+            <w:r>
+              <w:t>`--no-dwi-filter` or `QSIPREP_NO_DWI_FILTER=1`</w:t>
+            </w:r>
+          </w:p>
+        </w:tc>
+      </w:tr>
+    </w:tbl>
+    <w:p/>
+    <w:p>
+      <w:r>
+        <w:t>Dry-run:</w:t>
+      </w:r>
+    </w:p>
+    <w:p>
+      <w:r>
+        <w:rPr>
+          <w:rFonts w:ascii="Courier New" w:hAnsi="Courier New"/>
+          <w:sz w:val="18"/>
+        </w:rPr>
+        <w:t>python3 dwi_pipeline/scripts/build_bids_filter.py \</w:t>
+        <w:br/>
+        <w:t xml:space="preserve">  --bids-dir /path/to/bids --subject SUBJ01 \</w:t>
+        <w:br/>
+        <w:t xml:space="preserve">  --select-json dwi_pipeline/config/dwi_select_b1000.json \</w:t>
+        <w:br/>
+        <w:t xml:space="preserve">  --output /tmp/bids_filter_check.json</w:t>
+      </w:r>
+    </w:p>
+    <w:p/>
+    <w:p>
+      <w:pPr>
+        <w:pStyle w:val="Heading2"/>
+      </w:pPr>
+      <w:r>
+        <w:t>Strict fail-fast behavior</w:t>
+      </w:r>
+    </w:p>
+    <w:p>
+      <w:r>
+        <w:t xml:space="preserve">The pipeline avoids silent fallbacks. Failures print </w:t>
+      </w:r>
+      <w:r>
+        <w:rPr>
+          <w:rFonts w:ascii="Courier New" w:hAnsi="Courier New"/>
+        </w:rPr>
+        <w:t>ERROR [label]: ...</w:t>
+      </w:r>
+      <w:r>
+        <w:t xml:space="preserve"> and exit non-zero.</w:t>
+      </w:r>
+    </w:p>
+    <w:tbl>
+      <w:tblPr>
+        <w:tblStyle w:val="TableGrid"/>
+        <w:tblW w:type="auto" w:w="0"/>
+        <w:tblLook w:firstColumn="1" w:firstRow="1" w:lastColumn="0" w:lastRow="0" w:noHBand="0" w:noVBand="1" w:val="04A0"/>
+      </w:tblPr>
+      <w:tblGrid>
+        <w:gridCol w:w="4320"/>
+        <w:gridCol w:w="4320"/>
+      </w:tblGrid>
+      <w:tr>
+        <w:tc>
+          <w:tcPr>
+            <w:tcW w:type="dxa" w:w="4320"/>
+          </w:tcPr>
+          <w:p>
+            <w:r>
+              <w:t>Area</w:t>
+            </w:r>
+          </w:p>
+        </w:tc>
+        <w:tc>
+          <w:tcPr>
+            <w:tcW w:type="dxa" w:w="4320"/>
+          </w:tcPr>
+          <w:p>
+            <w:r>
+              <w:t>Behavior</w:t>
+            </w:r>
+          </w:p>
+        </w:tc>
+      </w:tr>
+      <w:tr>
+        <w:tc>
+          <w:tcPr>
+            <w:tcW w:type="dxa" w:w="4320"/>
+          </w:tcPr>
+          <w:p>
+            <w:r>
+              <w:t>FreeSurfer SIF</w:t>
+            </w:r>
+          </w:p>
+        </w:tc>
+        <w:tc>
+          <w:tcPr>
+            <w:tcW w:type="dxa" w:w="4320"/>
+          </w:tcPr>
+          <w:p>
+            <w:r>
+              <w:t>Requires `freesurfer_7.4.1.sif`; no fallback to FastSurfer's trimmed FS</w:t>
+            </w:r>
+          </w:p>
+        </w:tc>
+      </w:tr>
+      <w:tr>
+        <w:tc>
+          <w:tcPr>
+            <w:tcW w:type="dxa" w:w="4320"/>
+          </w:tcPr>
+          <w:p>
+            <w:r>
+              <w:t>SDC</w:t>
+            </w:r>
+          </w:p>
+        </w:tc>
+        <w:tc>
+          <w:tcPr>
+            <w:tcW w:type="dxa" w:w="4320"/>
+          </w:tcPr>
+          <w:p>
+            <w:r>
+              <w:t>Measured when fmap in filter; else require `--syn` or `--fmap-retry`</w:t>
+            </w:r>
+          </w:p>
+        </w:tc>
+      </w:tr>
+      <w:tr>
+        <w:tc>
+          <w:tcPr>
+            <w:tcW w:type="dxa" w:w="4320"/>
+          </w:tcPr>
+          <w:p>
+            <w:r>
+              <w:t>Recon rerun</w:t>
+            </w:r>
+          </w:p>
+        </w:tc>
+        <w:tc>
+          <w:tcPr>
+            <w:tcW w:type="dxa" w:w="4320"/>
+          </w:tcPr>
+          <w:p>
+            <w:r>
+              <w:t>Fails if `aparc+aseg.mgz` exists unless `RECON_SKIP_IF_EXISTS=1`</w:t>
+            </w:r>
+          </w:p>
+        </w:tc>
+      </w:tr>
+      <w:tr>
+        <w:tc>
+          <w:tcPr>
+            <w:tcW w:type="dxa" w:w="4320"/>
+          </w:tcPr>
+          <w:p>
+            <w:r>
+              <w:t>Step 4 inputs</w:t>
+            </w:r>
+          </w:p>
+        </w:tc>
+        <w:tc>
+          <w:tcPr>
+            <w:tcW w:type="dxa" w:w="4320"/>
+          </w:tcPr>
+          <w:p>
+            <w:r>
+              <w:t>Exactly one tractogram, dwiref, desc-preproc T1w, session-matched BIDS T1w</w:t>
+            </w:r>
+          </w:p>
+        </w:tc>
+      </w:tr>
+      <w:tr>
+        <w:tc>
+          <w:tcPr>
+            <w:tcW w:type="dxa" w:w="4320"/>
+          </w:tcPr>
+          <w:p>
+            <w:r>
+              <w:t>Step 4 space</w:t>
+            </w:r>
+          </w:p>
+        </w:tc>
+        <w:tc>
+          <w:tcPr>
+            <w:tcW w:type="dxa" w:w="4320"/>
+          </w:tcPr>
+          <w:p>
+            <w:r>
+              <w:t>`CONNECTOME_RESAMPLE_TO_DWI=1` required</w:t>
+            </w:r>
+          </w:p>
+        </w:tc>
+      </w:tr>
+      <w:tr>
+        <w:tc>
+          <w:tcPr>
+            <w:tcW w:type="dxa" w:w="4320"/>
+          </w:tcPr>
+          <w:p>
+            <w:r>
+              <w:t>`--no-recon`</w:t>
+            </w:r>
+          </w:p>
+        </w:tc>
+        <w:tc>
+          <w:tcPr>
+            <w:tcW w:type="dxa" w:w="4320"/>
+          </w:tcPr>
+          <w:p>
+            <w:r>
+              <w:t>Does not auto-switch to ACT-fast; set spec or provide FS dir</w:t>
+            </w:r>
+          </w:p>
+        </w:tc>
+      </w:tr>
+    </w:tbl>
+    <w:p/>
+    <w:p/>
     <w:p>
       <w:pPr>
         <w:pStyle w:val="Heading2"/>
@@ -122,7 +810,7 @@
           </w:tcPr>
           <w:p>
             <w:r>
-              <w:t>`.../CIDUR_BIDS/data_bids`</w:t>
+              <w:t>`$BIDS_DIR` — any [BIDS](https://bids.neuroimaging.io/)-valid dataset</w:t>
             </w:r>
           </w:p>
         </w:tc>
@@ -144,7 +832,7 @@
           </w:tcPr>
           <w:p>
             <w:r>
-              <w:t>`sub-001/ses-1/dwi/*_dwi.nii.gz`</w:t>
+              <w:t>`sub-XXX/ses-*/dwi/*_dwi.nii.gz`</w:t>
             </w:r>
           </w:p>
         </w:tc>
@@ -166,7 +854,7 @@
           </w:tcPr>
           <w:p>
             <w:r>
-              <w:t>`sub-001/ses-1/anat/*_T1w.nii.gz`</w:t>
+              <w:t>`sub-XXX/ses-*/anat/*_T1w.nii.gz`</w:t>
             </w:r>
           </w:p>
         </w:tc>
@@ -188,7 +876,7 @@
           </w:tcPr>
           <w:p>
             <w:r>
-              <w:t>`sub-001/ses-1/fmap/*` with `IntendedFor` in JSON</w:t>
+              <w:t>`sub-XXX/ses-*/fmap/*` with `IntendedFor` in JSON</w:t>
             </w:r>
           </w:p>
         </w:tc>
@@ -254,12 +942,13 @@
           </w:tcPr>
           <w:p>
             <w:r>
-              <w:t>`.../templateflow`</w:t>
+              <w:t>`$TEMPLATEFLOW_HOME` (defaults to `templateflow/` in the repo)</w:t>
             </w:r>
           </w:p>
         </w:tc>
       </w:tr>
     </w:tbl>
+    <w:p/>
     <w:p/>
     <w:p>
       <w:pPr>
@@ -279,54 +968,45 @@
     </w:p>
     <w:p>
       <w:r>
-        <w:t>QSIPrep preprocesses diffusion MRI data: distortion correction, registration of DWI to T1w, and derivative outputs in space-T1w. QSIPrep defines the reference space used for tractography and DK node alignment.</w:t>
+        <w:t xml:space="preserve">QSIPrep preprocesses diffusion MRI data: distortion correction, registration of DWI to T1w, and derivative outputs in </w:t>
       </w:r>
-    </w:p>
-    <w:p>
-      <w:pPr>
-        <w:pStyle w:val="Heading3"/>
-      </w:pPr>
       <w:r>
-        <w:t>Launcher</w:t>
+        <w:rPr>
+          <w:rFonts w:ascii="Courier New" w:hAnsi="Courier New"/>
+        </w:rPr>
+        <w:t>space-T1w</w:t>
+      </w:r>
+      <w:r>
+        <w:t>. QSIPrep defines the reference space used for tractography and DK node alignment.</w:t>
       </w:r>
     </w:p>
     <w:p>
       <w:r>
         <w:rPr>
-          <w:rFonts w:ascii="Consolas" w:hAnsi="Consolas"/>
-          <w:sz w:val="18"/>
+          <w:b/>
         </w:rPr>
-        <w:t>apptainer run --cleanenv --containall \</w:t>
-        <w:br/>
-        <w:t xml:space="preserve">  -B "${BIDS_DIR}":/bids_input:ro \</w:t>
-        <w:br/>
-        <w:t xml:space="preserve">  -B "${QSIPREP_OUT}":/output \</w:t>
-        <w:br/>
-        <w:t xml:space="preserve">  -B "${WORK_QSIPREP}":/work \</w:t>
-        <w:br/>
-        <w:t xml:space="preserve">  -B "${FS_LICENSE}":/opt/freesurfer/license.txt:ro \</w:t>
-        <w:br/>
-        <w:t xml:space="preserve">  -B "${TEMPLATEFLOW_HOME}":/templateflow \</w:t>
-        <w:br/>
-        <w:t xml:space="preserve">  --env "TEMPLATEFLOW_HOME=/templateflow" \</w:t>
-        <w:br/>
-        <w:t xml:space="preserve">  "${CONTAINER_QSIPREP}" \</w:t>
-        <w:br/>
-        <w:t xml:space="preserve">  /bids_input /output participant \</w:t>
-        <w:br/>
-        <w:t xml:space="preserve">  --participant-label "${SUBJECT}" \</w:t>
-        <w:br/>
-        <w:t xml:space="preserve">  --fs-license-file /opt/freesurfer/license.txt \</w:t>
-        <w:br/>
-        <w:t xml:space="preserve">  --work-dir /work \</w:t>
-        <w:br/>
-        <w:t xml:space="preserve">  --output-resolution 2 \</w:t>
-        <w:br/>
-        <w:t xml:space="preserve">  --nthreads 8 \</w:t>
-        <w:br/>
-        <w:t xml:space="preserve">  --omp-nthreads 8 \</w:t>
-        <w:br/>
-        <w:t xml:space="preserve">  --skip-bids-validation</w:t>
+        <w:t>Before the container runs</w:t>
+      </w:r>
+      <w:r>
+        <w:t xml:space="preserve">, </w:t>
+      </w:r>
+      <w:r>
+        <w:rPr>
+          <w:rFonts w:ascii="Courier New" w:hAnsi="Courier New"/>
+        </w:rPr>
+        <w:t>subject.sh</w:t>
+      </w:r>
+      <w:r>
+        <w:t xml:space="preserve"> builds a dwi-select BIDS filter (unless </w:t>
+      </w:r>
+      <w:r>
+        <w:rPr>
+          <w:rFonts w:ascii="Courier New" w:hAnsi="Courier New"/>
+        </w:rPr>
+        <w:t>--no-dwi-filter</w:t>
+      </w:r>
+      <w:r>
+        <w:t>).</w:t>
       </w:r>
     </w:p>
     <w:p>
@@ -364,7 +1044,7 @@
           </w:tcPr>
           <w:p>
             <w:r>
-              <w:t>Extra flags</w:t>
+              <w:t>Behavior</w:t>
             </w:r>
           </w:p>
         </w:tc>
@@ -376,7 +1056,7 @@
           </w:tcPr>
           <w:p>
             <w:r>
-              <w:t>BIDS fieldmap present</w:t>
+              <w:t>dwi-select includes fmap</w:t>
             </w:r>
           </w:p>
         </w:tc>
@@ -386,7 +1066,7 @@
           </w:tcPr>
           <w:p>
             <w:r>
-              <w:t>None; TOPUP runs automatically</w:t>
+              <w:t>**Measured SDC** (TOPUP / phasediff); log: `dwi-select includes fmap -&gt; measured SDC`</w:t>
             </w:r>
           </w:p>
         </w:tc>
@@ -398,7 +1078,7 @@
           </w:tcPr>
           <w:p>
             <w:r>
-              <w:t>No fieldmap, SyN opt-in</w:t>
+              <w:t>No fmap in filter + `--syn`</w:t>
             </w:r>
           </w:p>
         </w:tc>
@@ -420,7 +1100,7 @@
           </w:tcPr>
           <w:p>
             <w:r>
-              <w:t>Fieldmap retry mode</w:t>
+              <w:t>`--fmap-retry`</w:t>
             </w:r>
           </w:p>
         </w:tc>
@@ -435,28 +1115,89 @@
           </w:p>
         </w:tc>
       </w:tr>
+      <w:tr>
+        <w:tc>
+          <w:tcPr>
+            <w:tcW w:type="dxa" w:w="4320"/>
+          </w:tcPr>
+          <w:p>
+            <w:r>
+              <w:t>No fmap, no SyN flag</w:t>
+            </w:r>
+          </w:p>
+        </w:tc>
+        <w:tc>
+          <w:tcPr>
+            <w:tcW w:type="dxa" w:w="4320"/>
+          </w:tcPr>
+          <w:p>
+            <w:r>
+              <w:t>**Pipeline fails** (strict)</w:t>
+            </w:r>
+          </w:p>
+        </w:tc>
+      </w:tr>
     </w:tbl>
     <w:p/>
+    <w:p>
+      <w:r>
+        <w:t xml:space="preserve">See </w:t>
+      </w:r>
+      <w:r>
+        <w:rPr>
+          <w:rFonts w:ascii="Courier New" w:hAnsi="Courier New"/>
+        </w:rPr>
+        <w:t>fmaps.md</w:t>
+      </w:r>
+      <w:r>
+        <w:t xml:space="preserve"> for details.</w:t>
+      </w:r>
+    </w:p>
     <w:p>
       <w:pPr>
         <w:pStyle w:val="Heading3"/>
       </w:pPr>
       <w:r>
-        <w:t>Internal tools</w:t>
-      </w:r>
-    </w:p>
-    <w:p>
-      <w:r>
-        <w:t>QSIPrep invokes tools inside its workflow (not called manually), including topup, eddy, BBR, N4 bias correction, brain extraction, and resampling. With fieldmaps, logs may show:</w:t>
+        <w:t>Launcher (conceptual)</w:t>
       </w:r>
     </w:p>
     <w:p>
       <w:r>
         <w:rPr>
-          <w:rFonts w:ascii="Consolas" w:hAnsi="Consolas"/>
+          <w:rFonts w:ascii="Courier New" w:hAnsi="Courier New"/>
           <w:sz w:val="18"/>
         </w:rPr>
-        <w:t>[Node] Executing "topup" &lt;qsiprep.interfaces.fmap.ParallelTOPUP&gt;</w:t>
+        <w:t>apptainer run --cleanenv --containall \</w:t>
+        <w:br/>
+        <w:t xml:space="preserve">  -B "${BIDS_DIR}":/bids_input:ro \</w:t>
+        <w:br/>
+        <w:t xml:space="preserve">  -B "${QSIPREP_OUT}":/output \</w:t>
+        <w:br/>
+        <w:t xml:space="preserve">  -B "${WORK_QSIPREP}":/work \</w:t>
+        <w:br/>
+        <w:t xml:space="preserve">  -B "${FS_LICENSE}":/opt/freesurfer/license.txt:ro \</w:t>
+        <w:br/>
+        <w:t xml:space="preserve">  -B "${TEMPLATEFLOW_HOME}":/templateflow \</w:t>
+        <w:br/>
+        <w:t xml:space="preserve">  --env "TEMPLATEFLOW_HOME=/templateflow" \</w:t>
+        <w:br/>
+        <w:t xml:space="preserve">  "${CONTAINER_QSIPREP}" \</w:t>
+        <w:br/>
+        <w:t xml:space="preserve">  /bids_input /output participant \</w:t>
+        <w:br/>
+        <w:t xml:space="preserve">  --participant-label "${SUBJECT}" \</w:t>
+        <w:br/>
+        <w:t xml:space="preserve">  --bids-filter-file /work/bids_filter.json \</w:t>
+        <w:br/>
+        <w:t xml:space="preserve">  --fs-license-file /opt/freesurfer/license.txt \</w:t>
+        <w:br/>
+        <w:t xml:space="preserve">  --work-dir /work \</w:t>
+        <w:br/>
+        <w:t xml:space="preserve">  --output-resolution 2 \</w:t>
+        <w:br/>
+        <w:t xml:space="preserve">  --nthreads 8 --omp-nthreads 8 \</w:t>
+        <w:br/>
+        <w:t xml:space="preserve">  --skip-bids-validation</w:t>
       </w:r>
     </w:p>
     <w:p>
@@ -472,7 +1213,13 @@
         <w:pStyle w:val="ListBullet"/>
       </w:pPr>
       <w:r>
-        <w:t>`qsiprep_single_run_output/sub-001/anat/sub-001_desc-preproc_T1w.nii.gz`</w:t>
+        <w:rPr>
+          <w:rFonts w:ascii="Courier New" w:hAnsi="Courier New"/>
+        </w:rPr>
+        <w:t>qsiprep_single_run_output/sub-XXX/anat/sub-XXX_desc-preproc_T1w.nii.gz</w:t>
+      </w:r>
+      <w:r>
+        <w:t xml:space="preserve"> (subject- or session-level)</w:t>
       </w:r>
     </w:p>
     <w:p>
@@ -480,7 +1227,10 @@
         <w:pStyle w:val="ListBullet"/>
       </w:pPr>
       <w:r>
-        <w:t>`qsiprep_single_run_output/sub-001/ses-1/dwi/*_space-T1w_desc-preproc_dwi.nii.gz`</w:t>
+        <w:rPr>
+          <w:rFonts w:ascii="Courier New" w:hAnsi="Courier New"/>
+        </w:rPr>
+        <w:t>.../ses-*/dwi/*_space-T1w_desc-preproc_dwi.nii.gz</w:t>
       </w:r>
     </w:p>
     <w:p>
@@ -488,15 +1238,10 @@
         <w:pStyle w:val="ListBullet"/>
       </w:pPr>
       <w:r>
-        <w:t>`qsiprep_single_run_output/sub-001/ses-1/dwi/*_space-T1w_dwiref.nii.gz`</w:t>
-      </w:r>
-    </w:p>
-    <w:p>
-      <w:pPr>
-        <w:pStyle w:val="ListBullet"/>
-      </w:pPr>
-      <w:r>
-        <w:t>`qsiprep_single_run_output/sub-001/ses-1/anat/*_from-orig_to-T1w_mode-image_xfm.txt` (or `.mat`) — QSIPrep metadata; **not used directly by the DK step** (see Step 4)</w:t>
+        <w:rPr>
+          <w:rFonts w:ascii="Courier New" w:hAnsi="Courier New"/>
+        </w:rPr>
+        <w:t>.../ses-*/dwi/*_space-T1w_dwiref.nii.gz</w:t>
       </w:r>
     </w:p>
     <w:p>
@@ -512,7 +1257,13 @@
         <w:pStyle w:val="ListBullet"/>
       </w:pPr>
       <w:r>
-        <w:t>**`desc-preproc_T1w`** — approximately 1 mm isotropic (QSIPrep anatomical reference)</w:t>
+        <w:rPr>
+          <w:b/>
+        </w:rPr>
+        <w:t>`desc-preproc_T1w`</w:t>
+      </w:r>
+      <w:r>
+        <w:t xml:space="preserve"> — ~1 mm isotropic anatomical reference</w:t>
       </w:r>
     </w:p>
     <w:p>
@@ -520,14 +1271,39 @@
         <w:pStyle w:val="ListBullet"/>
       </w:pPr>
       <w:r>
-        <w:t>**DWI reference (`dwiref`)** — approximately 2 mm resolution (tractography grid)</w:t>
+        <w:rPr>
+          <w:b/>
+        </w:rPr>
+        <w:t>`dwiref`</w:t>
+      </w:r>
+      <w:r>
+        <w:t xml:space="preserve"> — ~2 mm tractography grid</w:t>
       </w:r>
     </w:p>
     <w:p>
       <w:r>
-        <w:t>Both are used later for tractography and DK alignment. The DK step also reads the BIDS T1w from data_bids to compute an empirical affine into desc-preproc_T1w.</w:t>
+        <w:t xml:space="preserve">The DK step reads </w:t>
+      </w:r>
+      <w:r>
+        <w:rPr>
+          <w:b/>
+        </w:rPr>
+        <w:t>BIDS T1w</w:t>
+      </w:r>
+      <w:r>
+        <w:t xml:space="preserve"> to compute an empirical affine into </w:t>
+      </w:r>
+      <w:r>
+        <w:rPr>
+          <w:rFonts w:ascii="Courier New" w:hAnsi="Courier New"/>
+        </w:rPr>
+        <w:t>desc-preproc_T1w</w:t>
+      </w:r>
+      <w:r>
+        <w:t>.</w:t>
       </w:r>
     </w:p>
+    <w:p/>
     <w:p>
       <w:pPr>
         <w:pStyle w:val="Heading2"/>
@@ -546,7 +1322,25 @@
     </w:p>
     <w:p>
       <w:r>
-        <w:t>FreeSurfer or FastSurfer parcellates the brain and produces aparc+aseg.mgz, an integer-labeled cortical and subcortical segmentation.</w:t>
+        <w:t xml:space="preserve">Parcellate the brain and produce </w:t>
+      </w:r>
+      <w:r>
+        <w:rPr>
+          <w:b/>
+        </w:rPr>
+        <w:t>`aparc+aseg.mgz`</w:t>
+      </w:r>
+      <w:r>
+        <w:t xml:space="preserve"> and </w:t>
+      </w:r>
+      <w:r>
+        <w:rPr>
+          <w:b/>
+        </w:rPr>
+        <w:t>`rawavg.mgz`</w:t>
+      </w:r>
+      <w:r>
+        <w:t xml:space="preserve"> (native T1w grid).</w:t>
       </w:r>
     </w:p>
     <w:p>
@@ -559,16 +1353,73 @@
     </w:p>
     <w:p>
       <w:r>
-        <w:t>Raw BIDS T1w, not the QSIPrep preprocessed T1w:</w:t>
+        <w:t xml:space="preserve">Raw </w:t>
+      </w:r>
+      <w:r>
+        <w:rPr>
+          <w:b/>
+        </w:rPr>
+        <w:t>BIDS T1w</w:t>
+      </w:r>
+      <w:r>
+        <w:t xml:space="preserve"> from the session selected by the dwi-select filter (not QSIPrep preprocessed T1w).</w:t>
       </w:r>
     </w:p>
     <w:p>
+      <w:pPr>
+        <w:pStyle w:val="Heading3"/>
+      </w:pPr>
+      <w:r>
+        <w:t>FreeSurfer requirements</w:t>
+      </w:r>
+    </w:p>
+    <w:p>
+      <w:pPr>
+        <w:pStyle w:val="ListBullet"/>
+      </w:pPr>
+      <w:r>
+        <w:t xml:space="preserve">Container: </w:t>
+      </w:r>
       <w:r>
         <w:rPr>
-          <w:rFonts w:ascii="Consolas" w:hAnsi="Consolas"/>
-          <w:sz w:val="18"/>
+          <w:b/>
         </w:rPr>
-        <w:t>/bids/sub-001/ses-1/anat/sub-001_ses-1_T1w.nii.gz</w:t>
+        <w:t>`freesurfer_7.4.1.sif`</w:t>
+      </w:r>
+      <w:r>
+        <w:t xml:space="preserve"> (dedicated full image; pipeline fails if missing)</w:t>
+      </w:r>
+    </w:p>
+    <w:p>
+      <w:pPr>
+        <w:pStyle w:val="ListBullet"/>
+      </w:pPr>
+      <w:r>
+        <w:t xml:space="preserve">If </w:t>
+      </w:r>
+      <w:r>
+        <w:rPr>
+          <w:rFonts w:ascii="Courier New" w:hAnsi="Courier New"/>
+        </w:rPr>
+        <w:t>aparc+aseg.mgz</w:t>
+      </w:r>
+      <w:r>
+        <w:t xml:space="preserve"> already exists: </w:t>
+      </w:r>
+      <w:r>
+        <w:rPr>
+          <w:b/>
+        </w:rPr>
+        <w:t>fail</w:t>
+      </w:r>
+      <w:r>
+        <w:t xml:space="preserve"> unless </w:t>
+      </w:r>
+      <w:r>
+        <w:rPr>
+          <w:rFonts w:ascii="Courier New" w:hAnsi="Courier New"/>
+        </w:rPr>
+        <w:t>RECON_SKIP_IF_EXISTS=1</w:t>
       </w:r>
     </w:p>
     <w:p>
@@ -580,8 +1431,17 @@
       </w:r>
     </w:p>
     <w:p>
+      <w:pPr>
+        <w:pStyle w:val="ListBullet"/>
+      </w:pPr>
       <w:r>
-        <w:t>FreeSurfer outputs are in conformed space:</w:t>
+        <w:rPr>
+          <w:rFonts w:ascii="Courier New" w:hAnsi="Courier New"/>
+        </w:rPr>
+        <w:t>aparc+aseg.mgz</w:t>
+      </w:r>
+      <w:r>
+        <w:t xml:space="preserve"> — FreeSurfer conformed (256³ @ 1 mm)</w:t>
       </w:r>
     </w:p>
     <w:p>
@@ -589,142 +1449,30 @@
         <w:pStyle w:val="ListBullet"/>
       </w:pPr>
       <w:r>
-        <w:t>256 × 256 × 256</w:t>
+        <w:rPr>
+          <w:rFonts w:ascii="Courier New" w:hAnsi="Courier New"/>
+        </w:rPr>
+        <w:t>rawavg.mgz</w:t>
       </w:r>
-    </w:p>
-    <w:p>
-      <w:pPr>
-        <w:pStyle w:val="ListBullet"/>
-      </w:pPr>
       <w:r>
-        <w:t>1 mm resolution</w:t>
-      </w:r>
-    </w:p>
-    <w:p>
-      <w:pPr>
-        <w:pStyle w:val="ListBullet"/>
-      </w:pPr>
-      <w:r>
-        <w:t>LIA orientation</w:t>
+        <w:t xml:space="preserve"> — native scanner T1w grid (used in DK Step 4a)</w:t>
       </w:r>
     </w:p>
     <w:p>
       <w:r>
-        <w:t>aparc+aseg.mgz is not yet in QSIPrep space. rawavg.mgz (native T1w grid) is also written and used in Step 4.</w:t>
+        <w:t xml:space="preserve">QSIPrep and FreeSurfer can run in parallel in principle; </w:t>
+      </w:r>
+      <w:r>
+        <w:rPr>
+          <w:rFonts w:ascii="Courier New" w:hAnsi="Courier New"/>
+        </w:rPr>
+        <w:t>subject.sh all</w:t>
+      </w:r>
+      <w:r>
+        <w:t xml:space="preserve"> runs QSIPrep first, then recon.</w:t>
       </w:r>
     </w:p>
-    <w:p>
-      <w:pPr>
-        <w:pStyle w:val="Heading3"/>
-      </w:pPr>
-      <w:r>
-        <w:t>Parallelization</w:t>
-      </w:r>
-    </w:p>
-    <w:p>
-      <w:r>
-        <w:t>QSIPrep and FreeSurfer can run in parallel; both read from BIDS and do not depend on each other.</w:t>
-      </w:r>
-    </w:p>
-    <w:p>
-      <w:pPr>
-        <w:pStyle w:val="Heading3"/>
-      </w:pPr>
-      <w:r>
-        <w:t>FreeSurfer launcher</w:t>
-      </w:r>
-    </w:p>
-    <w:p>
-      <w:r>
-        <w:rPr>
-          <w:rFonts w:ascii="Consolas" w:hAnsi="Consolas"/>
-          <w:sz w:val="18"/>
-        </w:rPr>
-        <w:t>apptainer exec --cleanenv --containall \</w:t>
-        <w:br/>
-        <w:t xml:space="preserve">  -B "${BIDS_DIR}":/bids:ro \</w:t>
-        <w:br/>
-        <w:t xml:space="preserve">  -B "${RECON_OUT}":/sd \</w:t>
-        <w:br/>
-        <w:t xml:space="preserve">  -B "${FS_LICENSE}":/.fs_license.txt:ro \</w:t>
-        <w:br/>
-        <w:t xml:space="preserve">  "${CONTAINER_FREESURFER}" \</w:t>
-        <w:br/>
-        <w:t xml:space="preserve">  bash -lc "</w:t>
-        <w:br/>
-        <w:t xml:space="preserve">    export FS_LICENSE=/.fs_license.txt</w:t>
-        <w:br/>
-        <w:t xml:space="preserve">    export SUBJECTS_DIR=/sd</w:t>
-        <w:br/>
-        <w:t xml:space="preserve">    recon-all -all -s sub-001 \</w:t>
-        <w:br/>
-        <w:t xml:space="preserve">      -i /bids/sub-001/ses-1/anat/sub-001_ses-1_T1w.nii.gz \</w:t>
-        <w:br/>
-        <w:t xml:space="preserve">      -openmp 8</w:t>
-        <w:br/>
-        <w:t xml:space="preserve">  "</w:t>
-      </w:r>
-    </w:p>
-    <w:p>
-      <w:pPr>
-        <w:pStyle w:val="Heading3"/>
-      </w:pPr>
-      <w:r>
-        <w:t>FastSurfer alternative</w:t>
-      </w:r>
-    </w:p>
-    <w:p>
-      <w:r>
-        <w:rPr>
-          <w:rFonts w:ascii="Consolas" w:hAnsi="Consolas"/>
-          <w:sz w:val="18"/>
-        </w:rPr>
-        <w:t>apptainer exec --cleanenv --containall \</w:t>
-        <w:br/>
-        <w:t xml:space="preserve">  -B "${BIDS_DIR}":/bids:ro \</w:t>
-        <w:br/>
-        <w:t xml:space="preserve">  -B "${RECON_OUT}":/sd \</w:t>
-        <w:br/>
-        <w:t xml:space="preserve">  -B "${FS_LICENSE}":/fs_license/license.txt:ro \</w:t>
-        <w:br/>
-        <w:t xml:space="preserve">  "${CONTAINER_FASTSURFER}" \</w:t>
-        <w:br/>
-        <w:t xml:space="preserve">  /fastsurfer/run_fastsurfer.sh \</w:t>
-        <w:br/>
-        <w:t xml:space="preserve">    --fs_license /fs_license/license.txt \</w:t>
-        <w:br/>
-        <w:t xml:space="preserve">    --sid sub-001 \</w:t>
-        <w:br/>
-        <w:t xml:space="preserve">    --sd /sd \</w:t>
-        <w:br/>
-        <w:t xml:space="preserve">    --t1 /bids/sub-001/ses-1/anat/sub-001_ses-1_T1w.nii.gz \</w:t>
-        <w:br/>
-        <w:t xml:space="preserve">    --parallel \</w:t>
-        <w:br/>
-        <w:t xml:space="preserve">    --threads 8 \</w:t>
-        <w:br/>
-        <w:t xml:space="preserve">    --device cpu</w:t>
-      </w:r>
-    </w:p>
-    <w:p>
-      <w:pPr>
-        <w:pStyle w:val="Heading3"/>
-      </w:pPr>
-      <w:r>
-        <w:t>Key output</w:t>
-      </w:r>
-    </w:p>
-    <w:p>
-      <w:r>
-        <w:rPr>
-          <w:rFonts w:ascii="Consolas" w:hAnsi="Consolas"/>
-          <w:sz w:val="18"/>
-        </w:rPr>
-        <w:t>freesurfer/sub-001/mri/aparc+aseg.mgz</w:t>
-        <w:br/>
-        <w:t>freesurfer/sub-001/mri/rawavg.mgz</w:t>
-      </w:r>
-    </w:p>
+    <w:p/>
     <w:p>
       <w:pPr>
         <w:pStyle w:val="Heading2"/>
@@ -743,65 +1491,25 @@
     </w:p>
     <w:p>
       <w:r>
-        <w:t>QSIRecon reads QSIPrep derivatives and reconstructs diffusion models. With the ACT-HSVS specification it uses FreeSurfer outputs to build tissue models for anatomically constrained tractography.</w:t>
+        <w:t xml:space="preserve">SS3T CSD + ACT tractography with HSVS 5TT (default spec </w:t>
       </w:r>
-    </w:p>
-    <w:p>
       <w:r>
-        <w:t>QSIRecon performs:</w:t>
+        <w:rPr>
+          <w:rFonts w:ascii="Courier New" w:hAnsi="Courier New"/>
+        </w:rPr>
+        <w:t>mrtrix_singleshell_ss3t_ACT-hsvs</w:t>
       </w:r>
-    </w:p>
-    <w:p>
-      <w:pPr>
-        <w:pStyle w:val="ListBullet"/>
-      </w:pPr>
       <w:r>
-        <w:t>FOD estimation (SS3T CSD)</w:t>
+        <w:t xml:space="preserve">). Produces ~10M streamlines and optional </w:t>
       </w:r>
-    </w:p>
-    <w:p>
-      <w:pPr>
-        <w:pStyle w:val="ListBullet"/>
-      </w:pPr>
       <w:r>
-        <w:t>5TT / HSVS generation</w:t>
+        <w:rPr>
+          <w:b/>
+        </w:rPr>
+        <w:t>4S156</w:t>
       </w:r>
-    </w:p>
-    <w:p>
-      <w:pPr>
-        <w:pStyle w:val="ListBullet"/>
-      </w:pPr>
       <w:r>
-        <w:t>Tractography (`tckgen`)</w:t>
-      </w:r>
-    </w:p>
-    <w:p>
-      <w:pPr>
-        <w:pStyle w:val="ListBullet"/>
-      </w:pPr>
-      <w:r>
-        <w:t>SIFT2 weighting</w:t>
-      </w:r>
-    </w:p>
-    <w:p>
-      <w:pPr>
-        <w:pStyle w:val="ListBullet"/>
-      </w:pPr>
-      <w:r>
-        <w:t>Optional atlas-based connectome generation</w:t>
-      </w:r>
-    </w:p>
-    <w:p>
-      <w:pPr>
-        <w:pStyle w:val="Heading3"/>
-      </w:pPr>
-      <w:r>
-        <w:t>Reference space</w:t>
-      </w:r>
-    </w:p>
-    <w:p>
-      <w:r>
-        <w:t>QSIRecon operates in QSIPrep T1w space.</w:t>
+        <w:t xml:space="preserve"> atlas connectome inside QSIRecon.</w:t>
       </w:r>
     </w:p>
     <w:p>
@@ -817,7 +1525,7 @@
         <w:pStyle w:val="ListBullet"/>
       </w:pPr>
       <w:r>
-        <w:t>QSIPrep outputs (Step 1)</w:t>
+        <w:t>QSIPrep outputs</w:t>
       </w:r>
     </w:p>
     <w:p>
@@ -825,132 +1533,7 @@
         <w:pStyle w:val="ListBullet"/>
       </w:pPr>
       <w:r>
-        <w:t>FreeSurfer outputs (Step 2) when using `mrtrix_singleshell_ss3t_ACT-hsvs`</w:t>
-      </w:r>
-    </w:p>
-    <w:p>
-      <w:pPr>
-        <w:pStyle w:val="Heading3"/>
-      </w:pPr>
-      <w:r>
-        <w:t>Launcher</w:t>
-      </w:r>
-    </w:p>
-    <w:p>
-      <w:r>
-        <w:rPr>
-          <w:rFonts w:ascii="Consolas" w:hAnsi="Consolas"/>
-          <w:sz w:val="18"/>
-        </w:rPr>
-        <w:t>apptainer run --cleanenv --containall \</w:t>
-        <w:br/>
-        <w:t xml:space="preserve">  -B "${QSIPREP_OUT}":/qsiprep_input:ro \</w:t>
-        <w:br/>
-        <w:t xml:space="preserve">  -B "${QSIRECON_OUT}":/output \</w:t>
-        <w:br/>
-        <w:t xml:space="preserve">  -B "${WORK_QSIRECON}":/work \</w:t>
-        <w:br/>
-        <w:t xml:space="preserve">  -B "${FS_SUBJECTS_DIR}":/freesurfer:ro \</w:t>
-        <w:br/>
-        <w:t xml:space="preserve">  -B "${FS_LICENSE}":/opt/freesurfer/license.txt:ro \</w:t>
-        <w:br/>
-        <w:t xml:space="preserve">  -B "${TEMPLATEFLOW_HOME}":/templateflow \</w:t>
-        <w:br/>
-        <w:t xml:space="preserve">  --env "TEMPLATEFLOW_HOME=/templateflow" \</w:t>
-        <w:br/>
-        <w:t xml:space="preserve">  "${CONTAINER_QSIRECON}" \</w:t>
-        <w:br/>
-        <w:t xml:space="preserve">  /qsiprep_input /output participant \</w:t>
-        <w:br/>
-        <w:t xml:space="preserve">  --input-type qsiprep \</w:t>
-        <w:br/>
-        <w:t xml:space="preserve">  --recon-spec mrtrix_singleshell_ss3t_ACT-hsvs \</w:t>
-        <w:br/>
-        <w:t xml:space="preserve">  --participant-label 001 \</w:t>
-        <w:br/>
-        <w:t xml:space="preserve">  --fs-license-file /opt/freesurfer/license.txt \</w:t>
-        <w:br/>
-        <w:t xml:space="preserve">  --fs-subjects-dir /freesurfer \</w:t>
-        <w:br/>
-        <w:t xml:space="preserve">  --work-dir /work \</w:t>
-        <w:br/>
-        <w:t xml:space="preserve">  --nthreads 8 \</w:t>
-        <w:br/>
-        <w:t xml:space="preserve">  --omp-nthreads 8 \</w:t>
-        <w:br/>
-        <w:t xml:space="preserve">  --output-resolution 2 \</w:t>
-        <w:br/>
-        <w:t xml:space="preserve">  --atlases 4S156Parcels</w:t>
-      </w:r>
-    </w:p>
-    <w:p>
-      <w:pPr>
-        <w:pStyle w:val="Heading3"/>
-      </w:pPr>
-      <w:r>
-        <w:t>Internal MRtrix workflow (conceptual)</w:t>
-      </w:r>
-    </w:p>
-    <w:p>
-      <w:pPr>
-        <w:pStyle w:val="ListNumber"/>
-      </w:pPr>
-      <w:r>
-        <w:t>Estimate FODs (`dwi2fod` / SS3T CSD)</w:t>
-      </w:r>
-    </w:p>
-    <w:p>
-      <w:pPr>
-        <w:pStyle w:val="ListNumber"/>
-      </w:pPr>
-      <w:r>
-        <w:t>Build HSVS / 5TT tissue map in T1w space from FreeSurfer surfaces</w:t>
-      </w:r>
-    </w:p>
-    <w:p>
-      <w:pPr>
-        <w:pStyle w:val="ListNumber"/>
-      </w:pPr>
-      <w:r>
-        <w:t>Run ACT tractography:</w:t>
-      </w:r>
-    </w:p>
-    <w:p>
-      <w:r>
-        <w:rPr>
-          <w:rFonts w:ascii="Consolas" w:hAnsi="Consolas"/>
-          <w:sz w:val="18"/>
-        </w:rPr>
-        <w:t>tckgen -act &lt;5tt_in_T1w.nii.gz&gt; \</w:t>
-        <w:br/>
-        <w:t xml:space="preserve">  -algorithm iFOD2 \</w:t>
-        <w:br/>
-        <w:t xml:space="preserve">  -backtrack \</w:t>
-        <w:br/>
-        <w:t xml:space="preserve">  -crop_at_gmwmi \</w:t>
-        <w:br/>
-        <w:t xml:space="preserve">  -select 10000000 \</w:t>
-        <w:br/>
-        <w:t xml:space="preserve">  &lt;wm_mtnorm.mif&gt; \</w:t>
-        <w:br/>
-        <w:t xml:space="preserve">  tracked.tck</w:t>
-      </w:r>
-    </w:p>
-    <w:p>
-      <w:pPr>
-        <w:pStyle w:val="ListNumber"/>
-      </w:pPr>
-      <w:r>
-        <w:t>Apply SIFT2 weighting; optionally build an atlas connectome:</w:t>
-      </w:r>
-    </w:p>
-    <w:p>
-      <w:r>
-        <w:rPr>
-          <w:rFonts w:ascii="Consolas" w:hAnsi="Consolas"/>
-          <w:sz w:val="18"/>
-        </w:rPr>
-        <w:t>tck2connectome &lt;streamlines.tck&gt; &lt;4S156_dseg.mif&gt; connectivity.mat</w:t>
+        <w:t>FreeSurfer subjects dir when using ACT-HSVS spec</w:t>
       </w:r>
     </w:p>
     <w:p>
@@ -966,7 +1549,10 @@
         <w:pStyle w:val="ListBullet"/>
       </w:pPr>
       <w:r>
-        <w:t>`sub-001_ses-1_*_space-T1w_model-ifod2_streamlines.tck.gz`</w:t>
+        <w:rPr>
+          <w:rFonts w:ascii="Courier New" w:hAnsi="Courier New"/>
+        </w:rPr>
+        <w:t>*_space-T1w_model-ifod2_streamlines.tck.gz</w:t>
       </w:r>
     </w:p>
     <w:p>
@@ -974,7 +1560,22 @@
         <w:pStyle w:val="ListBullet"/>
       </w:pPr>
       <w:r>
-        <w:t>`sub-001_ses-1_*_space-T1w_connectivity.mat`</w:t>
+        <w:rPr>
+          <w:rFonts w:ascii="Courier New" w:hAnsi="Courier New"/>
+        </w:rPr>
+        <w:t>*_space-T1w_connectivity.mat</w:t>
+      </w:r>
+      <w:r>
+        <w:t xml:space="preserve"> (if </w:t>
+      </w:r>
+      <w:r>
+        <w:rPr>
+          <w:rFonts w:ascii="Courier New" w:hAnsi="Courier New"/>
+        </w:rPr>
+        <w:t>--atlases 4S156Parcels</w:t>
+      </w:r>
+      <w:r>
+        <w:t>)</w:t>
       </w:r>
     </w:p>
     <w:p>
@@ -982,20 +1583,38 @@
         <w:pStyle w:val="ListBullet"/>
       </w:pPr>
       <w:r>
-        <w:t>`sub-001/anat/sub-001_space-fsnative_seg-hsvs_probseg.mif.gz`</w:t>
+        <w:t>HSVS / 5TT tissue maps</w:t>
       </w:r>
     </w:p>
     <w:p>
       <w:r>
-        <w:t>The tractogram is in QSIPrep T1w space. FreeSurfer provides surfaces and tissue information for HSVS/5TT; it does not define the tractography voxel grid.</w:t>
+        <w:t xml:space="preserve">Tractogram is in </w:t>
+      </w:r>
+      <w:r>
+        <w:rPr>
+          <w:b/>
+        </w:rPr>
+        <w:t>QSIPrep T1w space</w:t>
+      </w:r>
+      <w:r>
+        <w:t>.</w:t>
       </w:r>
     </w:p>
+    <w:p/>
     <w:p>
       <w:pPr>
         <w:pStyle w:val="Heading2"/>
       </w:pPr>
       <w:r>
-        <w:t>Step 4 — Post-hoc Desikan–Killiany connectome</w:t>
+        <w:t>Step 4 — Post-hoc anatomical connectome</w:t>
+      </w:r>
+    </w:p>
+    <w:p>
+      <w:r>
+        <w:rPr>
+          <w:i/>
+        </w:rPr>
+        <w:t>Skipped when `RUN_CONNECTOME=0` (`dwi_connect_default` / `--no-connectome`).</w:t>
       </w:r>
     </w:p>
     <w:p>
@@ -1008,7 +1627,117 @@
     </w:p>
     <w:p>
       <w:r>
-        <w:t>Build an 84-node DK connectome from the QSIRecon tractogram and FreeSurfer aparc+aseg.mgz.</w:t>
+        <w:t>Build an anatomical connectome from the QSIRecon tractogram and a FreeSurfer parcellation.</w:t>
+      </w:r>
+    </w:p>
+    <w:p>
+      <w:r>
+        <w:t xml:space="preserve">The default is the </w:t>
+      </w:r>
+      <w:r>
+        <w:rPr>
+          <w:b/>
+        </w:rPr>
+        <w:t>78-node Desikan–Killiany–Tourville (DKT)</w:t>
+      </w:r>
+      <w:r>
+        <w:t xml:space="preserve"> matrix, from either recon tool:</w:t>
+      </w:r>
+    </w:p>
+    <w:p>
+      <w:r>
+        <w:t xml:space="preserve">FastSurfer's </w:t>
+      </w:r>
+      <w:r>
+        <w:rPr>
+          <w:rFonts w:ascii="Courier New" w:hAnsi="Courier New"/>
+        </w:rPr>
+        <w:t>aparc+aseg.mgz</w:t>
+      </w:r>
+      <w:r>
+        <w:t xml:space="preserve"> is already DKT, and a </w:t>
+      </w:r>
+      <w:r>
+        <w:rPr>
+          <w:rFonts w:ascii="Courier New" w:hAnsi="Courier New"/>
+        </w:rPr>
+        <w:t>recon-all</w:t>
+      </w:r>
+      <w:r>
+        <w:t xml:space="preserve"> tree is read via its</w:t>
+      </w:r>
+    </w:p>
+    <w:p>
+      <w:r>
+        <w:rPr>
+          <w:rFonts w:ascii="Courier New" w:hAnsi="Courier New"/>
+        </w:rPr>
+        <w:t>aparc.DKTatlas+aseg.mgz</w:t>
+      </w:r>
+      <w:r>
+        <w:t xml:space="preserve">. The </w:t>
+      </w:r>
+      <w:r>
+        <w:rPr>
+          <w:b/>
+        </w:rPr>
+        <w:t>84-node Desikan–Killiany (DK)</w:t>
+      </w:r>
+      <w:r>
+        <w:t xml:space="preserve"> matrix is available with</w:t>
+      </w:r>
+    </w:p>
+    <w:p>
+      <w:r>
+        <w:rPr>
+          <w:rFonts w:ascii="Courier New" w:hAnsi="Courier New"/>
+        </w:rPr>
+        <w:t>CONNECTOME_PARCELLATION=dk</w:t>
+      </w:r>
+      <w:r>
+        <w:t xml:space="preserve">, but only from </w:t>
+      </w:r>
+      <w:r>
+        <w:rPr>
+          <w:rFonts w:ascii="Courier New" w:hAnsi="Courier New"/>
+        </w:rPr>
+        <w:t>recon-all</w:t>
+      </w:r>
+      <w:r>
+        <w:t>.</w:t>
+      </w:r>
+    </w:p>
+    <w:p>
+      <w:r>
+        <w:t xml:space="preserve">The lookup table and the segmentation must describe the same atlas: </w:t>
+      </w:r>
+      <w:r>
+        <w:rPr>
+          <w:rFonts w:ascii="Courier New" w:hAnsi="Courier New"/>
+        </w:rPr>
+        <w:t>labelconvert</w:t>
+      </w:r>
+      <w:r>
+        <w:t xml:space="preserve"> matches</w:t>
+      </w:r>
+    </w:p>
+    <w:p>
+      <w:r>
+        <w:t xml:space="preserve">regions by name, so applying the DKT table to a DK image silently </w:t>
+      </w:r>
+      <w:r>
+        <w:rPr>
+          <w:i/>
+        </w:rPr>
+        <w:t>drops</w:t>
+      </w:r>
+      <w:r>
+        <w:t xml:space="preserve"> bankssts and the</w:t>
+      </w:r>
+    </w:p>
+    <w:p>
+      <w:r>
+        <w:t>frontal/temporal poles instead of reassigning their territory to neighbouring gyri.</w:t>
       </w:r>
     </w:p>
     <w:p>
@@ -1017,11 +1746,6 @@
       </w:pPr>
       <w:r>
         <w:t>Coordinate alignment</w:t>
-      </w:r>
-    </w:p>
-    <w:p>
-      <w:r>
-        <w:t>FreeSurfer labels must be warped into the QSIPrep DWI reference grid before tck2connectome counts streamline endpoints.</w:t>
       </w:r>
     </w:p>
     <w:tbl>
@@ -1148,17 +1872,40 @@
     <w:p/>
     <w:p>
       <w:r>
-        <w:t>Labels are moved from conformed space to native space, then warped into QSIPrep anatomical space via an empirical affine (BIDS T1w → desc-preproc_T1w), then resampled onto the tractography dwiref grid.</w:t>
+        <w:rPr>
+          <w:b/>
+        </w:rPr>
+        <w:t>Why not QSIPrep's packaged `from-T1wNative_to-T1wACPC` alone?</w:t>
       </w:r>
-    </w:p>
-    <w:p>
       <w:r>
-        <w:t>Why not QSIPrep’s from-orig_to-T1w / from-T1wNative_to-T1wACPC? Those transforms assume QSIPrep’s reoriented T1wNative frame. FreeSurfer rawavg.mgz and the BIDS T1w share scanner-native headers; applying QSIPrep’s packaged .mat alone mis-aligns labels by ~20+ mm in ITK-SNAP QC. The affine registration bridges BIDS T1w to desc-preproc_T1w empirically.</w:t>
+        <w:t xml:space="preserve"> FreeSurfer </w:t>
       </w:r>
-    </w:p>
-    <w:p>
       <w:r>
-        <w:t>For multi-session datasets, select BIDS T1w, desc-preproc_T1w, and dwiref from the same session as the tractogram.</w:t>
+        <w:rPr>
+          <w:rFonts w:ascii="Courier New" w:hAnsi="Courier New"/>
+        </w:rPr>
+        <w:t>rawavg.mgz</w:t>
+      </w:r>
+      <w:r>
+        <w:t xml:space="preserve"> and BIDS T1w share scanner-native headers; an </w:t>
+      </w:r>
+      <w:r>
+        <w:rPr>
+          <w:b/>
+        </w:rPr>
+        <w:t>empirical affine</w:t>
+      </w:r>
+      <w:r>
+        <w:t xml:space="preserve"> (BIDS T1w → </w:t>
+      </w:r>
+      <w:r>
+        <w:rPr>
+          <w:rFonts w:ascii="Courier New" w:hAnsi="Courier New"/>
+        </w:rPr>
+        <w:t>desc-preproc_T1w</w:t>
+      </w:r>
+      <w:r>
+        <w:t>) bridges the gap. Session-matched T1w, dwiref, and tractogram are required.</w:t>
       </w:r>
     </w:p>
     <w:p>
@@ -1208,7 +1955,7 @@
           </w:tcPr>
           <w:p>
             <w:r>
-              <w:t>4a — `mri_label2vol`</w:t>
+              <w:t>4a–4f (default)</w:t>
             </w:r>
           </w:p>
         </w:tc>
@@ -1218,7 +1965,7 @@
           </w:tcPr>
           <w:p>
             <w:r>
-              <w:t>`freesurfer_7.4.1.sif`</w:t>
+              <w:t>`dkt_connectome.sif` — FreeSurfer 7.4.1 + ANTs + MRtrix3</w:t>
             </w:r>
           </w:p>
         </w:tc>
@@ -1230,7 +1977,7 @@
           </w:tcPr>
           <w:p>
             <w:r>
-              <w:t>4b–4f — ANTs, MRtrix</w:t>
+              <w:t>4a–4f (legacy)</w:t>
             </w:r>
           </w:p>
         </w:tc>
@@ -1240,7 +1987,7 @@
           </w:tcPr>
           <w:p>
             <w:r>
-              <w:t>`qsirecon.sif`</w:t>
+              <w:t>`freesurfer_7.4.1.sif` + `qsirecon.sif` when `CONNECTOME_LEGACY_DUAL_CONTAINER=1`</w:t>
             </w:r>
           </w:p>
         </w:tc>
@@ -1249,23 +1996,30 @@
     <w:p/>
     <w:p>
       <w:r>
-        <w:rPr>
-          <w:rFonts w:ascii="Consolas" w:hAnsi="Consolas"/>
-          <w:sz w:val="18"/>
-        </w:rPr>
-        <w:t># Step 4a</w:t>
-        <w:br/>
-        <w:t>apptainer exec ... "${CONTAINER_FREESURFER}" bash -lc 'mri_label2vol ...'</w:t>
-        <w:br/>
-        <w:br/>
-        <w:t># Steps 4b–4f</w:t>
-        <w:br/>
-        <w:t>apptainer exec ... "${CONTAINER_QSIRECON}" bash -lc 'antsRegistration ...; antsApplyTransforms ...; labelconvert ...; tck2connectome ...'</w:t>
+        <w:t>Build the Step 4 image:</w:t>
       </w:r>
     </w:p>
     <w:p>
       <w:r>
-        <w:t>Bind mounts: FreeSurfer subject dir, BIDS input, QSIPrep output, QSIRecon output, DK output directory, license, and FreeSurfer LUT.</w:t>
+        <w:rPr>
+          <w:rFonts w:ascii="Courier New" w:hAnsi="Courier New"/>
+          <w:sz w:val="18"/>
+        </w:rPr>
+        <w:t>bash dwi_pipeline/containers/connectome/build_connectome.sh</w:t>
+      </w:r>
+    </w:p>
+    <w:p>
+      <w:r>
+        <w:t xml:space="preserve">Runtime binds: FreeSurfer subject dir, QSIPrep/QSIRecon outputs, BIDS T1w, output dir, and </w:t>
+      </w:r>
+      <w:r>
+        <w:rPr>
+          <w:rFonts w:ascii="Courier New" w:hAnsi="Courier New"/>
+        </w:rPr>
+        <w:t>FS_LICENSE</w:t>
+      </w:r>
+      <w:r>
+        <w:t>.</w:t>
       </w:r>
     </w:p>
     <w:p>
@@ -1279,21 +2033,18 @@
     <w:p>
       <w:r>
         <w:rPr>
-          <w:rFonts w:ascii="Consolas" w:hAnsi="Consolas"/>
+          <w:rFonts w:ascii="Courier New" w:hAnsi="Courier New"/>
           <w:sz w:val="18"/>
         </w:rPr>
-        <w:t>mri_label2vol --seg /fs_subject/mri/aparc+aseg.mgz \</w:t>
+        <w:t># $SEG is aparc+aseg.mgz, or aparc.DKTatlas+aseg.mgz for DKT from recon-all</w:t>
+        <w:br/>
+        <w:t>mri_label2vol --seg $SEG \</w:t>
         <w:br/>
         <w:t xml:space="preserve">  --temp /fs_subject/mri/rawavg.mgz \</w:t>
         <w:br/>
         <w:t xml:space="preserve">  --o /out/aparc+aseg_in_rawavg.mgz \</w:t>
         <w:br/>
-        <w:t xml:space="preserve">  --regheader /fs_subject/mri/aparc+aseg.mgz</w:t>
-      </w:r>
-    </w:p>
-    <w:p>
-      <w:r>
-        <w:t>Output: aparc+aseg_in_rawavg.mgz on the native T1w grid.</w:t>
+        <w:t xml:space="preserve">  --regheader $SEG</w:t>
       </w:r>
     </w:p>
     <w:p>
@@ -1301,281 +2052,73 @@
         <w:pStyle w:val="Heading3"/>
       </w:pPr>
       <w:r>
-        <w:t>Step 4b — Warp labels into QSIPrep space (three sub-steps)</w:t>
+        <w:t>Step 4b — Warp into QSIPrep space</w:t>
       </w:r>
     </w:p>
     <w:p>
+      <w:pPr>
+        <w:pStyle w:val="ListNumber"/>
+      </w:pPr>
       <w:r>
-        <w:t>#### 4b-1 — Affine register BIDS T1w → desc-preproc_T1w</w:t>
+        <w:t xml:space="preserve">Affine register BIDS T1w → </w:t>
+      </w:r>
+      <w:r>
+        <w:rPr>
+          <w:rFonts w:ascii="Courier New" w:hAnsi="Courier New"/>
+        </w:rPr>
+        <w:t>desc-preproc_T1w</w:t>
+      </w:r>
+      <w:r>
+        <w:t xml:space="preserve"> (</w:t>
+      </w:r>
+      <w:r>
+        <w:rPr>
+          <w:rFonts w:ascii="Courier New" w:hAnsi="Courier New"/>
+        </w:rPr>
+        <w:t>antsRegistration</w:t>
+      </w:r>
+      <w:r>
+        <w:t>)</w:t>
       </w:r>
     </w:p>
     <w:p>
+      <w:pPr>
+        <w:pStyle w:val="ListNumber"/>
+      </w:pPr>
+      <w:r>
+        <w:t xml:space="preserve">Apply affine to native labels → </w:t>
+      </w:r>
       <w:r>
         <w:rPr>
-          <w:rFonts w:ascii="Consolas" w:hAnsi="Consolas"/>
-          <w:sz w:val="18"/>
+          <w:rFonts w:ascii="Courier New" w:hAnsi="Courier New"/>
         </w:rPr>
-        <w:t>mri_convert /out/aparc+aseg_in_rawavg.mgz /out/aparc+aseg_in_rawavg.nii.gz</w:t>
-        <w:br/>
-        <w:br/>
-        <w:t>antsRegistration --dimensionality 3 --float 0 \</w:t>
-        <w:br/>
-        <w:t xml:space="preserve">  --output [/out/native_to_preproc_T1w_,/out/native_to_preproc_T1w_Warped.nii.gz] \</w:t>
-        <w:br/>
-        <w:t xml:space="preserve">  --interpolation Linear \</w:t>
-        <w:br/>
-        <w:t xml:space="preserve">  --winsorize-image-intensities [0.005,0.995] \</w:t>
-        <w:br/>
-        <w:t xml:space="preserve">  --use-histogram-matching 1 \</w:t>
-        <w:br/>
-        <w:t xml:space="preserve">  --transform Affine[0.1] \</w:t>
-        <w:br/>
-        <w:t xml:space="preserve">  --metric MI[/qsiprep/sub-001/anat/sub-001_desc-preproc_T1w.nii.gz,/bids/sub-001/ses-1/anat/sub-001_ses-1_T1w.nii.gz,1,32] \</w:t>
-        <w:br/>
-        <w:t xml:space="preserve">  --convergence [500x250x100,1e-6,10] \</w:t>
-        <w:br/>
-        <w:t xml:space="preserve">  --shrink-factors 4x2x1 \</w:t>
-        <w:br/>
-        <w:t xml:space="preserve">  --smoothing-sigmas 2x1x0vox</w:t>
+        <w:t>aparc+aseg_in_t1w.nii.gz</w:t>
       </w:r>
     </w:p>
     <w:p>
+      <w:pPr>
+        <w:pStyle w:val="ListNumber"/>
+      </w:pPr>
       <w:r>
-        <w:t>Output: native_to_preproc_T1w_0GenericAffine.mat (empirical native/BIDS → QSIPrep T1w).</w:t>
+        <w:t xml:space="preserve">Resample onto </w:t>
       </w:r>
-    </w:p>
-    <w:p>
-      <w:r>
-        <w:t>#### 4b-2 — Apply affine to native labels → QSIPrep T1w grid</w:t>
-      </w:r>
-    </w:p>
-    <w:p>
       <w:r>
         <w:rPr>
-          <w:rFonts w:ascii="Consolas" w:hAnsi="Consolas"/>
-          <w:sz w:val="18"/>
+          <w:rFonts w:ascii="Courier New" w:hAnsi="Courier New"/>
         </w:rPr>
-        <w:t>antsApplyTransforms -d 3 \</w:t>
-        <w:br/>
-        <w:t xml:space="preserve">  -i /out/aparc+aseg_in_rawavg.nii.gz \</w:t>
-        <w:br/>
-        <w:t xml:space="preserve">  -r /qsiprep/sub-001/anat/sub-001_desc-preproc_T1w.nii.gz \</w:t>
-        <w:br/>
-        <w:t xml:space="preserve">  -t /out/native_to_preproc_T1w_0GenericAffine.mat \</w:t>
-        <w:br/>
-        <w:t xml:space="preserve">  -n GenericLabel \</w:t>
-        <w:br/>
-        <w:t xml:space="preserve">  -o /out/aparc+aseg_in_t1w.nii.gz</w:t>
+        <w:t>dwiref</w:t>
       </w:r>
-    </w:p>
-    <w:tbl>
-      <w:tblPr>
-        <w:tblStyle w:val="TableGrid"/>
-        <w:tblW w:type="auto" w:w="0"/>
-        <w:tblLook w:firstColumn="1" w:firstRow="1" w:lastColumn="0" w:lastRow="0" w:noHBand="0" w:noVBand="1" w:val="04A0"/>
-      </w:tblPr>
-      <w:tblGrid>
-        <w:gridCol w:w="4320"/>
-        <w:gridCol w:w="4320"/>
-      </w:tblGrid>
-      <w:tr>
-        <w:tc>
-          <w:tcPr>
-            <w:tcW w:type="dxa" w:w="4320"/>
-          </w:tcPr>
-          <w:p>
-            <w:r>
-              <w:t>Flag</w:t>
-            </w:r>
-          </w:p>
-        </w:tc>
-        <w:tc>
-          <w:tcPr>
-            <w:tcW w:type="dxa" w:w="4320"/>
-          </w:tcPr>
-          <w:p>
-            <w:r>
-              <w:t>Role</w:t>
-            </w:r>
-          </w:p>
-        </w:tc>
-      </w:tr>
-      <w:tr>
-        <w:tc>
-          <w:tcPr>
-            <w:tcW w:type="dxa" w:w="4320"/>
-          </w:tcPr>
-          <w:p>
-            <w:r>
-              <w:t>`-r desc-preproc_T1w`</w:t>
-            </w:r>
-          </w:p>
-        </w:tc>
-        <w:tc>
-          <w:tcPr>
-            <w:tcW w:type="dxa" w:w="4320"/>
-          </w:tcPr>
-          <w:p>
-            <w:r>
-              <w:t>QSIPrep anatomical reference (~1 mm)</w:t>
-            </w:r>
-          </w:p>
-        </w:tc>
-      </w:tr>
-      <w:tr>
-        <w:tc>
-          <w:tcPr>
-            <w:tcW w:type="dxa" w:w="4320"/>
-          </w:tcPr>
-          <w:p>
-            <w:r>
-              <w:t>`-t native_to_preproc_T1w_0GenericAffine.mat`</w:t>
-            </w:r>
-          </w:p>
-        </w:tc>
-        <w:tc>
-          <w:tcPr>
-            <w:tcW w:type="dxa" w:w="4320"/>
-          </w:tcPr>
-          <w:p>
-            <w:r>
-              <w:t>BIDS/scanner-native → QSIPrep T1w</w:t>
-            </w:r>
-          </w:p>
-        </w:tc>
-      </w:tr>
-      <w:tr>
-        <w:tc>
-          <w:tcPr>
-            <w:tcW w:type="dxa" w:w="4320"/>
-          </w:tcPr>
-          <w:p>
-            <w:r>
-              <w:t>`-n GenericLabel`</w:t>
-            </w:r>
-          </w:p>
-        </w:tc>
-        <w:tc>
-          <w:tcPr>
-            <w:tcW w:type="dxa" w:w="4320"/>
-          </w:tcPr>
-          <w:p>
-            <w:r>
-              <w:t>Label-safe interpolation</w:t>
-            </w:r>
-          </w:p>
-        </w:tc>
-      </w:tr>
-    </w:tbl>
-    <w:p/>
-    <w:p>
       <w:r>
-        <w:t>Output: aparc+aseg_in_t1w.nii.gz on the QSIPrep T1w grid.</w:t>
+        <w:t xml:space="preserve"> grid (</w:t>
       </w:r>
-    </w:p>
-    <w:p>
-      <w:r>
-        <w:t>#### 4b-3 — Resample onto the tractography dwiref grid</w:t>
-      </w:r>
-    </w:p>
-    <w:p>
       <w:r>
         <w:rPr>
-          <w:rFonts w:ascii="Consolas" w:hAnsi="Consolas"/>
-          <w:sz w:val="18"/>
+          <w:rFonts w:ascii="Courier New" w:hAnsi="Courier New"/>
         </w:rPr>
-        <w:t>antsApplyTransforms -d 3 \</w:t>
-        <w:br/>
-        <w:t xml:space="preserve">  -i /out/aparc+aseg_in_t1w.nii.gz \</w:t>
-        <w:br/>
-        <w:t xml:space="preserve">  -r /qsiprep/sub-001/ses-1/dwi/sub-001_ses-1_*_space-T1w_dwiref.nii.gz \</w:t>
-        <w:br/>
-        <w:t xml:space="preserve">  -n GenericLabel \</w:t>
-        <w:br/>
-        <w:t xml:space="preserve">  -o /out/aparc+aseg_in_dwi.nii.gz</w:t>
+        <w:t>antsApplyTransforms -n GenericLabel</w:t>
       </w:r>
-    </w:p>
-    <w:tbl>
-      <w:tblPr>
-        <w:tblStyle w:val="TableGrid"/>
-        <w:tblW w:type="auto" w:w="0"/>
-        <w:tblLook w:firstColumn="1" w:firstRow="1" w:lastColumn="0" w:lastRow="0" w:noHBand="0" w:noVBand="1" w:val="04A0"/>
-      </w:tblPr>
-      <w:tblGrid>
-        <w:gridCol w:w="4320"/>
-        <w:gridCol w:w="4320"/>
-      </w:tblGrid>
-      <w:tr>
-        <w:tc>
-          <w:tcPr>
-            <w:tcW w:type="dxa" w:w="4320"/>
-          </w:tcPr>
-          <w:p>
-            <w:r>
-              <w:t>Flag</w:t>
-            </w:r>
-          </w:p>
-        </w:tc>
-        <w:tc>
-          <w:tcPr>
-            <w:tcW w:type="dxa" w:w="4320"/>
-          </w:tcPr>
-          <w:p>
-            <w:r>
-              <w:t>Role</w:t>
-            </w:r>
-          </w:p>
-        </w:tc>
-      </w:tr>
-      <w:tr>
-        <w:tc>
-          <w:tcPr>
-            <w:tcW w:type="dxa" w:w="4320"/>
-          </w:tcPr>
-          <w:p>
-            <w:r>
-              <w:t>`-r dwiref`</w:t>
-            </w:r>
-          </w:p>
-        </w:tc>
-        <w:tc>
-          <w:tcPr>
-            <w:tcW w:type="dxa" w:w="4320"/>
-          </w:tcPr>
-          <w:p>
-            <w:r>
-              <w:t>Target grid (QSIPrep T1w tractography reference, ~2 mm)</w:t>
-            </w:r>
-          </w:p>
-        </w:tc>
-      </w:tr>
-      <w:tr>
-        <w:tc>
-          <w:tcPr>
-            <w:tcW w:type="dxa" w:w="4320"/>
-          </w:tcPr>
-          <w:p>
-            <w:r>
-              <w:t>`-n GenericLabel`</w:t>
-            </w:r>
-          </w:p>
-        </w:tc>
-        <w:tc>
-          <w:tcPr>
-            <w:tcW w:type="dxa" w:w="4320"/>
-          </w:tcPr>
-          <w:p>
-            <w:r>
-              <w:t>Label-safe interpolation (no transform — same space, different grid)</w:t>
-            </w:r>
-          </w:p>
-        </w:tc>
-      </w:tr>
-    </w:tbl>
-    <w:p/>
-    <w:p>
       <w:r>
-        <w:t>Output: aparc+aseg_in_dwi.nii.gz aligned to the tractogram grid.</w:t>
+        <w:t>)</w:t>
       </w:r>
     </w:p>
     <w:p>
@@ -1583,27 +2126,24 @@
         <w:pStyle w:val="Heading3"/>
       </w:pPr>
       <w:r>
-        <w:t>Step 4c — Map labels to DK node indices</w:t>
+        <w:t>Step 4c–4f — Connectome</w:t>
       </w:r>
     </w:p>
     <w:p>
       <w:r>
         <w:rPr>
-          <w:rFonts w:ascii="Consolas" w:hAnsi="Consolas"/>
+          <w:rFonts w:ascii="Courier New" w:hAnsi="Courier New"/>
           <w:sz w:val="18"/>
         </w:rPr>
-        <w:t>labelconvert -force /out/aparc+aseg_in_dwi.nii.gz \</w:t>
+        <w:t># $LUT is fs_default.txt (DK, 84 nodes) or fs_dkt.txt (DKT, 78 nodes)</w:t>
         <w:br/>
-        <w:t xml:space="preserve">  /opt/freesurfer/FreeSurferColorLUT.txt \</w:t>
+        <w:t>labelconvert ... $LUT /out/nodes.mif</w:t>
         <w:br/>
-        <w:t xml:space="preserve">  /opt/mrtrix3-latest/share/mrtrix3/labelconvert/fs_default.txt \</w:t>
+        <w:t>tck2connectome -symmetric -zero_diagonal \</w:t>
         <w:br/>
-        <w:t xml:space="preserve">  /out/dk_nodes.mif</w:t>
-      </w:r>
-    </w:p>
-    <w:p>
-      <w:r>
-        <w:t>Maps FreeSurfer label IDs to DK node indices (1–84).</w:t>
+        <w:t xml:space="preserve">  /out/streamlines.tck /out/nodes.mif /out/connectome.csv \</w:t>
+        <w:br/>
+        <w:t xml:space="preserve">  -out_assignments /out/assignments.csv</w:t>
       </w:r>
     </w:p>
     <w:p>
@@ -1611,97 +2151,7 @@
         <w:pStyle w:val="Heading3"/>
       </w:pPr>
       <w:r>
-        <w:t>Step 4d — Prepare tractogram</w:t>
-      </w:r>
-    </w:p>
-    <w:p>
-      <w:r>
-        <w:t>MRtrix 3.0.4 may require an uncompressed .tck:</w:t>
-      </w:r>
-    </w:p>
-    <w:p>
-      <w:r>
-        <w:rPr>
-          <w:rFonts w:ascii="Consolas" w:hAnsi="Consolas"/>
-          <w:sz w:val="18"/>
-        </w:rPr>
-        <w:t>gunzip -c /qsirecon/.../streamlines.tck.gz &gt; /out/streamlines.tck</w:t>
-      </w:r>
-    </w:p>
-    <w:p>
-      <w:pPr>
-        <w:pStyle w:val="Heading3"/>
-      </w:pPr>
-      <w:r>
-        <w:t>Step 4e — Quality control</w:t>
-      </w:r>
-    </w:p>
-    <w:p>
-      <w:r>
-        <w:t>Confirm tractogram and node image share a compatible grid:</w:t>
-      </w:r>
-    </w:p>
-    <w:p>
-      <w:r>
-        <w:rPr>
-          <w:rFonts w:ascii="Consolas" w:hAnsi="Consolas"/>
-          <w:sz w:val="18"/>
-        </w:rPr>
-        <w:t>mrinfo /out/dk_nodes.mif      | tee /out/dk_nodes.mrinfo.txt</w:t>
-        <w:br/>
-        <w:t>tckinfo /out/streamlines.tck  | tee /out/tracks.tckinfo.txt</w:t>
-      </w:r>
-    </w:p>
-    <w:p>
-      <w:r>
-        <w:t>dk_nodes.mif dimensions and voxel size should match the preprocessed DWI / dwiref image.</w:t>
-      </w:r>
-    </w:p>
-    <w:p>
-      <w:pPr>
-        <w:pStyle w:val="Heading3"/>
-      </w:pPr>
-      <w:r>
-        <w:t>Step 4f — Build connectome matrix</w:t>
-      </w:r>
-    </w:p>
-    <w:p>
-      <w:r>
-        <w:rPr>
-          <w:rFonts w:ascii="Consolas" w:hAnsi="Consolas"/>
-          <w:sz w:val="18"/>
-        </w:rPr>
-        <w:t>tck2connectome -force \</w:t>
-        <w:br/>
-        <w:t xml:space="preserve">  /out/streamlines.tck \</w:t>
-        <w:br/>
-        <w:t xml:space="preserve">  /out/dk_nodes.mif \</w:t>
-        <w:br/>
-        <w:t xml:space="preserve">  /out/dk_connectome.csv \</w:t>
-        <w:br/>
-        <w:t xml:space="preserve">  -symmetric \</w:t>
-        <w:br/>
-        <w:t xml:space="preserve">  -zero_diagonal \</w:t>
-        <w:br/>
-        <w:t xml:space="preserve">  -out_assignments /out/dk_assignments.csv</w:t>
-      </w:r>
-    </w:p>
-    <w:p>
-      <w:r>
-        <w:t>For each streamline, MRtrix reads endpoint voxels in dk_nodes.mif and increments the corresponding entry in the symmetric matrix M[i, j].</w:t>
-      </w:r>
-    </w:p>
-    <w:p>
-      <w:pPr>
-        <w:pStyle w:val="Heading3"/>
-      </w:pPr>
-      <w:r>
-        <w:t>DK outputs</w:t>
-      </w:r>
-    </w:p>
-    <w:p>
-      <w:r>
-        <w:t>Directory: dk_connectomes/sub-001/</w:t>
+        <w:t>Step 4 outputs (connectomes/sub-XXX/)</w:t>
       </w:r>
     </w:p>
     <w:tbl>
@@ -1743,7 +2193,7 @@
           </w:tcPr>
           <w:p>
             <w:r>
-              <w:t>`dk_connectome.csv`</w:t>
+              <w:t>`dkt_connectome.csv`</w:t>
             </w:r>
           </w:p>
         </w:tc>
@@ -1753,7 +2203,7 @@
           </w:tcPr>
           <w:p>
             <w:r>
-              <w:t>84 × 84 symmetric streamline-count matrix</w:t>
+              <w:t>78 × 78 symmetric streamline-count matrix (default)</w:t>
             </w:r>
           </w:p>
         </w:tc>
@@ -1765,7 +2215,51 @@
           </w:tcPr>
           <w:p>
             <w:r>
-              <w:t>`dk_assignments.csv`</w:t>
+              <w:t>`dk_connectome.csv`</w:t>
+            </w:r>
+          </w:p>
+        </w:tc>
+        <w:tc>
+          <w:tcPr>
+            <w:tcW w:type="dxa" w:w="4320"/>
+          </w:tcPr>
+          <w:p>
+            <w:r>
+              <w:t>84 × 84 instead, when `CONNECTOME_PARCELLATION=dk`</w:t>
+            </w:r>
+          </w:p>
+        </w:tc>
+      </w:tr>
+      <w:tr>
+        <w:tc>
+          <w:tcPr>
+            <w:tcW w:type="dxa" w:w="4320"/>
+          </w:tcPr>
+          <w:p>
+            <w:r>
+              <w:t>`parcellation.json`</w:t>
+            </w:r>
+          </w:p>
+        </w:tc>
+        <w:tc>
+          <w:tcPr>
+            <w:tcW w:type="dxa" w:w="4320"/>
+          </w:tcPr>
+          <w:p>
+            <w:r>
+              <w:t>Atlas, node count, LUT, segmentation read, empty-node count</w:t>
+            </w:r>
+          </w:p>
+        </w:tc>
+      </w:tr>
+      <w:tr>
+        <w:tc>
+          <w:tcPr>
+            <w:tcW w:type="dxa" w:w="4320"/>
+          </w:tcPr>
+          <w:p>
+            <w:r>
+              <w:t>`assignments.csv`</w:t>
             </w:r>
           </w:p>
         </w:tc>
@@ -1787,7 +2281,7 @@
           </w:tcPr>
           <w:p>
             <w:r>
-              <w:t>`aparc+aseg_in_rawavg.mgz`</w:t>
+              <w:t>`nodes.mif` / `nodes.mrinfo.txt`</w:t>
             </w:r>
           </w:p>
         </w:tc>
@@ -1797,7 +2291,51 @@
           </w:tcPr>
           <w:p>
             <w:r>
-              <w:t>Labels on native T1w grid</w:t>
+              <w:t>MRtrix label image + QC metadata</w:t>
+            </w:r>
+          </w:p>
+        </w:tc>
+      </w:tr>
+      <w:tr>
+        <w:tc>
+          <w:tcPr>
+            <w:tcW w:type="dxa" w:w="4320"/>
+          </w:tcPr>
+          <w:p>
+            <w:r>
+              <w:t>`tracks.tckinfo.txt`</w:t>
+            </w:r>
+          </w:p>
+        </w:tc>
+        <w:tc>
+          <w:tcPr>
+            <w:tcW w:type="dxa" w:w="4320"/>
+          </w:tcPr>
+          <w:p>
+            <w:r>
+              <w:t>Tractogram QC (expect ~10M streamlines)</w:t>
+            </w:r>
+          </w:p>
+        </w:tc>
+      </w:tr>
+      <w:tr>
+        <w:tc>
+          <w:tcPr>
+            <w:tcW w:type="dxa" w:w="4320"/>
+          </w:tcPr>
+          <w:p>
+            <w:r>
+              <w:t>`aparc+aseg_in_dwi.nii.gz`</w:t>
+            </w:r>
+          </w:p>
+        </w:tc>
+        <w:tc>
+          <w:tcPr>
+            <w:tcW w:type="dxa" w:w="4320"/>
+          </w:tcPr>
+          <w:p>
+            <w:r>
+              <w:t>Labels on tractography grid</w:t>
             </w:r>
           </w:p>
         </w:tc>
@@ -1819,236 +2357,14 @@
           </w:tcPr>
           <w:p>
             <w:r>
-              <w:t>Empirical BIDS T1w → `desc-preproc_T1w` affine</w:t>
-            </w:r>
-          </w:p>
-        </w:tc>
-      </w:tr>
-      <w:tr>
-        <w:tc>
-          <w:tcPr>
-            <w:tcW w:type="dxa" w:w="4320"/>
-          </w:tcPr>
-          <w:p>
-            <w:r>
-              <w:t>`aparc+aseg_in_t1w.nii.gz`</w:t>
-            </w:r>
-          </w:p>
-        </w:tc>
-        <w:tc>
-          <w:tcPr>
-            <w:tcW w:type="dxa" w:w="4320"/>
-          </w:tcPr>
-          <w:p>
-            <w:r>
-              <w:t>Labels on QSIPrep `desc-preproc_T1w` grid</w:t>
-            </w:r>
-          </w:p>
-        </w:tc>
-      </w:tr>
-      <w:tr>
-        <w:tc>
-          <w:tcPr>
-            <w:tcW w:type="dxa" w:w="4320"/>
-          </w:tcPr>
-          <w:p>
-            <w:r>
-              <w:t>`aparc+aseg_in_dwi.nii.gz`</w:t>
-            </w:r>
-          </w:p>
-        </w:tc>
-        <w:tc>
-          <w:tcPr>
-            <w:tcW w:type="dxa" w:w="4320"/>
-          </w:tcPr>
-          <w:p>
-            <w:r>
-              <w:t>Labels resampled to tractography `dwiref` grid</w:t>
-            </w:r>
-          </w:p>
-        </w:tc>
-      </w:tr>
-      <w:tr>
-        <w:tc>
-          <w:tcPr>
-            <w:tcW w:type="dxa" w:w="4320"/>
-          </w:tcPr>
-          <w:p>
-            <w:r>
-              <w:t>`dk_nodes.mif`</w:t>
-            </w:r>
-          </w:p>
-        </w:tc>
-        <w:tc>
-          <w:tcPr>
-            <w:tcW w:type="dxa" w:w="4320"/>
-          </w:tcPr>
-          <w:p>
-            <w:r>
-              <w:t>MRtrix label image (84 DK nodes)</w:t>
-            </w:r>
-          </w:p>
-        </w:tc>
-      </w:tr>
-      <w:tr>
-        <w:tc>
-          <w:tcPr>
-            <w:tcW w:type="dxa" w:w="4320"/>
-          </w:tcPr>
-          <w:p>
-            <w:r>
-              <w:t>`dk_nodes.mrinfo.txt`</w:t>
-            </w:r>
-          </w:p>
-        </w:tc>
-        <w:tc>
-          <w:tcPr>
-            <w:tcW w:type="dxa" w:w="4320"/>
-          </w:tcPr>
-          <w:p>
-            <w:r>
-              <w:t>Node image metadata (QC)</w:t>
-            </w:r>
-          </w:p>
-        </w:tc>
-      </w:tr>
-      <w:tr>
-        <w:tc>
-          <w:tcPr>
-            <w:tcW w:type="dxa" w:w="4320"/>
-          </w:tcPr>
-          <w:p>
-            <w:r>
-              <w:t>`tracks.tckinfo.txt`</w:t>
-            </w:r>
-          </w:p>
-        </w:tc>
-        <w:tc>
-          <w:tcPr>
-            <w:tcW w:type="dxa" w:w="4320"/>
-          </w:tcPr>
-          <w:p>
-            <w:r>
-              <w:t>Tractogram metadata (QC)</w:t>
+              <w:t>BIDS T1w → desc-preproc_T1w affine</w:t>
             </w:r>
           </w:p>
         </w:tc>
       </w:tr>
     </w:tbl>
     <w:p/>
-    <w:p>
-      <w:pPr>
-        <w:pStyle w:val="Heading2"/>
-      </w:pPr>
-      <w:r>
-        <w:t>How the spaces connect</w:t>
-      </w:r>
-    </w:p>
-    <w:tbl>
-      <w:tblPr>
-        <w:tblStyle w:val="TableGrid"/>
-        <w:tblW w:type="auto" w:w="0"/>
-        <w:tblLook w:firstColumn="1" w:firstRow="1" w:lastColumn="0" w:lastRow="0" w:noHBand="0" w:noVBand="1" w:val="04A0"/>
-      </w:tblPr>
-      <w:tblGrid>
-        <w:gridCol w:w="4320"/>
-        <w:gridCol w:w="4320"/>
-      </w:tblGrid>
-      <w:tr>
-        <w:tc>
-          <w:tcPr>
-            <w:tcW w:type="dxa" w:w="4320"/>
-          </w:tcPr>
-          <w:p>
-            <w:r>
-              <w:t>Stage</w:t>
-            </w:r>
-          </w:p>
-        </w:tc>
-        <w:tc>
-          <w:tcPr>
-            <w:tcW w:type="dxa" w:w="4320"/>
-          </w:tcPr>
-          <w:p>
-            <w:r>
-              <w:t>Space</w:t>
-            </w:r>
-          </w:p>
-        </w:tc>
-      </w:tr>
-      <w:tr>
-        <w:tc>
-          <w:tcPr>
-            <w:tcW w:type="dxa" w:w="4320"/>
-          </w:tcPr>
-          <w:p>
-            <w:r>
-              <w:t>QSIPrep / QSIRecon tractography</w:t>
-            </w:r>
-          </w:p>
-        </w:tc>
-        <w:tc>
-          <w:tcPr>
-            <w:tcW w:type="dxa" w:w="4320"/>
-          </w:tcPr>
-          <w:p>
-            <w:r>
-              <w:t>QSIPrep T1w, 2 mm DWI reference grid</w:t>
-            </w:r>
-          </w:p>
-        </w:tc>
-      </w:tr>
-      <w:tr>
-        <w:tc>
-          <w:tcPr>
-            <w:tcW w:type="dxa" w:w="4320"/>
-          </w:tcPr>
-          <w:p>
-            <w:r>
-              <w:t>FreeSurfer `aparc+aseg.mgz`</w:t>
-            </w:r>
-          </w:p>
-        </w:tc>
-        <w:tc>
-          <w:tcPr>
-            <w:tcW w:type="dxa" w:w="4320"/>
-          </w:tcPr>
-          <w:p>
-            <w:r>
-              <w:t>FreeSurfer conformed space</w:t>
-            </w:r>
-          </w:p>
-        </w:tc>
-      </w:tr>
-      <w:tr>
-        <w:tc>
-          <w:tcPr>
-            <w:tcW w:type="dxa" w:w="4320"/>
-          </w:tcPr>
-          <w:p>
-            <w:r>
-              <w:t>DK connectome</w:t>
-            </w:r>
-          </w:p>
-        </w:tc>
-        <w:tc>
-          <w:tcPr>
-            <w:tcW w:type="dxa" w:w="4320"/>
-          </w:tcPr>
-          <w:p>
-            <w:r>
-              <w:t>FreeSurfer labels warped into QSIPrep T1w / `dwiref` space</w:t>
-            </w:r>
-          </w:p>
-        </w:tc>
-      </w:tr>
-    </w:tbl>
     <w:p/>
-    <w:p>
-      <w:r>
-        <w:t>Streamlines and DK nodes must share the same coordinate frame before connectome generation.</w:t>
-      </w:r>
-    </w:p>
     <w:p>
       <w:pPr>
         <w:pStyle w:val="Heading2"/>
@@ -2062,33 +2378,49 @@
         <w:pStyle w:val="Heading3"/>
       </w:pPr>
       <w:r>
-        <w:t>Full run (one subject)</w:t>
+        <w:t>Full pipeline with the anatomical connectome (recommended)</w:t>
       </w:r>
     </w:p>
     <w:p>
       <w:r>
         <w:rPr>
-          <w:rFonts w:ascii="Consolas" w:hAnsi="Consolas"/>
+          <w:rFonts w:ascii="Courier New" w:hAnsi="Courier New"/>
           <w:sz w:val="18"/>
         </w:rPr>
-        <w:t>export BIDS_DIR=.../data_bids</w:t>
+        <w:t>cd /path/to/repo</w:t>
         <w:br/>
-        <w:t>export RESULTS_ROOT=.../dwi_test2</w:t>
+        <w:br/>
+        <w:t>export BIDS_DIR=/path/to/bids</w:t>
+        <w:br/>
+        <w:t>export RESULTS_ROOT=/path/to/results</w:t>
         <w:br/>
         <w:t>export PIPELINE_MODE=all</w:t>
         <w:br/>
-        <w:t>export QSIRECON_SPEC=mrtrix_singleshell_ss3t_ACT-hsvs</w:t>
-        <w:br/>
-        <w:t>export QSIRECON_ATLASES=4S156Parcels</w:t>
-        <w:br/>
-        <w:t>export RUN_RECON=1</w:t>
-        <w:br/>
-        <w:t>export RECON_TOOL=freesurfer</w:t>
-        <w:br/>
-        <w:t>export RUN_DK_CONNECTOME=1</w:t>
+        <w:t>export RUN_CONNECTOME=1</w:t>
         <w:br/>
         <w:br/>
-        <w:t>bash dwi_pipeline/subject.sh all 001</w:t>
+        <w:t>bash dwi_pipeline/subject.sh all SUBJ01</w:t>
+      </w:r>
+    </w:p>
+    <w:p>
+      <w:pPr>
+        <w:pStyle w:val="Heading3"/>
+      </w:pPr>
+      <w:r>
+        <w:t>Atlas connectome only (no Step 4)</w:t>
+      </w:r>
+    </w:p>
+    <w:p>
+      <w:r>
+        <w:rPr>
+          <w:rFonts w:ascii="Courier New" w:hAnsi="Courier New"/>
+          <w:sz w:val="18"/>
+        </w:rPr>
+        <w:t>export RESULTS_ROOT=/path/to/results_atlas_only</w:t>
+        <w:br/>
+        <w:t>bash dwi_connect_default/subject.sh all SUBJ01</w:t>
+        <w:br/>
+        <w:t># or: ./dwi_connect_default/submit.sh</w:t>
       </w:r>
     </w:p>
     <w:p>
@@ -2102,16 +2434,16 @@
     <w:p>
       <w:r>
         <w:rPr>
-          <w:rFonts w:ascii="Consolas" w:hAnsi="Consolas"/>
+          <w:rFonts w:ascii="Courier New" w:hAnsi="Courier New"/>
           <w:sz w:val="18"/>
         </w:rPr>
-        <w:t>bash dwi_pipeline/subject.sh qsiprep 001</w:t>
+        <w:t>bash dwi_pipeline/subject.sh qsiprep SUBJ01</w:t>
         <w:br/>
-        <w:t>bash dwi_pipeline/subject.sh recon 001</w:t>
+        <w:t>bash dwi_pipeline/subject.sh recon SUBJ01</w:t>
         <w:br/>
-        <w:t>bash dwi_pipeline/subject.sh qsirecon 001</w:t>
+        <w:t>bash dwi_pipeline/subject.sh qsirecon SUBJ01</w:t>
         <w:br/>
-        <w:t>bash dwi_pipeline/subject.sh dk 001</w:t>
+        <w:t>bash dwi_pipeline/subject.sh connectome SUBJ01</w:t>
       </w:r>
     </w:p>
     <w:p>
@@ -2119,168 +2451,29 @@
         <w:pStyle w:val="Heading3"/>
       </w:pPr>
       <w:r>
-        <w:t>Stage dependencies</w:t>
-      </w:r>
-    </w:p>
-    <w:tbl>
-      <w:tblPr>
-        <w:tblStyle w:val="TableGrid"/>
-        <w:tblW w:type="auto" w:w="0"/>
-        <w:tblLook w:firstColumn="1" w:firstRow="1" w:lastColumn="0" w:lastRow="0" w:noHBand="0" w:noVBand="1" w:val="04A0"/>
-      </w:tblPr>
-      <w:tblGrid>
-        <w:gridCol w:w="4320"/>
-        <w:gridCol w:w="4320"/>
-      </w:tblGrid>
-      <w:tr>
-        <w:tc>
-          <w:tcPr>
-            <w:tcW w:type="dxa" w:w="4320"/>
-          </w:tcPr>
-          <w:p>
-            <w:r>
-              <w:t>Stage</w:t>
-            </w:r>
-          </w:p>
-        </w:tc>
-        <w:tc>
-          <w:tcPr>
-            <w:tcW w:type="dxa" w:w="4320"/>
-          </w:tcPr>
-          <w:p>
-            <w:r>
-              <w:t>Requires</w:t>
-            </w:r>
-          </w:p>
-        </w:tc>
-      </w:tr>
-      <w:tr>
-        <w:tc>
-          <w:tcPr>
-            <w:tcW w:type="dxa" w:w="4320"/>
-          </w:tcPr>
-          <w:p>
-            <w:r>
-              <w:t>`qsiprep`</w:t>
-            </w:r>
-          </w:p>
-        </w:tc>
-        <w:tc>
-          <w:tcPr>
-            <w:tcW w:type="dxa" w:w="4320"/>
-          </w:tcPr>
-          <w:p>
-            <w:r>
-              <w:t>BIDS input</w:t>
-            </w:r>
-          </w:p>
-        </w:tc>
-      </w:tr>
-      <w:tr>
-        <w:tc>
-          <w:tcPr>
-            <w:tcW w:type="dxa" w:w="4320"/>
-          </w:tcPr>
-          <w:p>
-            <w:r>
-              <w:t>`recon`</w:t>
-            </w:r>
-          </w:p>
-        </w:tc>
-        <w:tc>
-          <w:tcPr>
-            <w:tcW w:type="dxa" w:w="4320"/>
-          </w:tcPr>
-          <w:p>
-            <w:r>
-              <w:t>BIDS T1w</w:t>
-            </w:r>
-          </w:p>
-        </w:tc>
-      </w:tr>
-      <w:tr>
-        <w:tc>
-          <w:tcPr>
-            <w:tcW w:type="dxa" w:w="4320"/>
-          </w:tcPr>
-          <w:p>
-            <w:r>
-              <w:t>`qsirecon`</w:t>
-            </w:r>
-          </w:p>
-        </w:tc>
-        <w:tc>
-          <w:tcPr>
-            <w:tcW w:type="dxa" w:w="4320"/>
-          </w:tcPr>
-          <w:p>
-            <w:r>
-              <w:t>QSIPrep + recon outputs</w:t>
-            </w:r>
-          </w:p>
-        </w:tc>
-      </w:tr>
-      <w:tr>
-        <w:tc>
-          <w:tcPr>
-            <w:tcW w:type="dxa" w:w="4320"/>
-          </w:tcPr>
-          <w:p>
-            <w:r>
-              <w:t>`dk`</w:t>
-            </w:r>
-          </w:p>
-        </w:tc>
-        <w:tc>
-          <w:tcPr>
-            <w:tcW w:type="dxa" w:w="4320"/>
-          </w:tcPr>
-          <w:p>
-            <w:r>
-              <w:t>QSIRecon + recon outputs</w:t>
-            </w:r>
-          </w:p>
-        </w:tc>
-      </w:tr>
-    </w:tbl>
-    <w:p/>
-    <w:p>
-      <w:r>
-        <w:t>QSIPrep and recon can run in parallel. QSIRecon needs both. The DK step needs the tractogram, parcellation, and QSIPrep transforms.</w:t>
-      </w:r>
-    </w:p>
-    <w:p>
-      <w:pPr>
-        <w:pStyle w:val="Heading3"/>
-      </w:pPr>
-      <w:r>
-        <w:t>Slurm submission</w:t>
+        <w:t>Slurm array</w:t>
       </w:r>
     </w:p>
     <w:p>
       <w:r>
         <w:rPr>
-          <w:rFonts w:ascii="Consolas" w:hAnsi="Consolas"/>
+          <w:rFonts w:ascii="Courier New" w:hAnsi="Courier New"/>
           <w:sz w:val="18"/>
         </w:rPr>
-        <w:t>export RESULTS_ROOT=.../dwi_test2</w:t>
+        <w:t>export RESULTS_ROOT=/path/to/results</w:t>
         <w:br/>
         <w:t>export SUBJECT_LIST_FILE=dwi_pipeline/subjects.txt</w:t>
         <w:br/>
         <w:t>./dwi_pipeline/submit.sh</w:t>
       </w:r>
     </w:p>
+    <w:p/>
     <w:p>
       <w:pPr>
         <w:pStyle w:val="Heading2"/>
       </w:pPr>
       <w:r>
         <w:t>Two connectomes, one tractogram</w:t>
-      </w:r>
-    </w:p>
-    <w:p>
-      <w:r>
-        <w:t>The same tractogram can support two connectome outputs:</w:t>
       </w:r>
     </w:p>
     <w:tbl>
@@ -2353,7 +2546,7 @@
           </w:tcPr>
           <w:p>
             <w:r>
-              <w:t>QSIRecon built-in atlas connectome</w:t>
+              <w:t>QSIRecon (`--atlases 4S156Parcels`)</w:t>
             </w:r>
           </w:p>
         </w:tc>
@@ -2365,7 +2558,7 @@
           </w:tcPr>
           <w:p>
             <w:r>
-              <w:t>`dk_connectome.csv`</w:t>
+              <w:t>`dkt_connectome.csv`</w:t>
             </w:r>
           </w:p>
         </w:tc>
@@ -2375,7 +2568,7 @@
           </w:tcPr>
           <w:p>
             <w:r>
-              <w:t>Desikan–Killiany (84 regions)</w:t>
+              <w:t>Desikan–Killiany–Tourville (78 regions)</w:t>
             </w:r>
           </w:p>
         </w:tc>
@@ -2385,7 +2578,7 @@
           </w:tcPr>
           <w:p>
             <w:r>
-              <w:t>Post-hoc DK step</w:t>
+              <w:t>Post-hoc Step 4</w:t>
             </w:r>
           </w:p>
         </w:tc>
@@ -2397,6 +2590,7 @@
         <w:t>Only the label map differs; the underlying streamline set is the same.</w:t>
       </w:r>
     </w:p>
+    <w:p/>
     <w:p>
       <w:pPr>
         <w:pStyle w:val="Heading2"/>
@@ -2444,7 +2638,7 @@
           </w:tcPr>
           <w:p>
             <w:r>
-              <w:t>QSIPrep</w:t>
+              <w:t>BIDS repair</w:t>
             </w:r>
           </w:p>
         </w:tc>
@@ -2454,7 +2648,7 @@
           </w:tcPr>
           <w:p>
             <w:r>
-              <w:t>SDC applied; TOPUP when fieldmaps are in BIDS</w:t>
+              <w:t>PE/TRT/`IntendedFor` applied before QSIPrep</w:t>
             </w:r>
           </w:p>
         </w:tc>
@@ -2466,7 +2660,7 @@
           </w:tcPr>
           <w:p>
             <w:r>
-              <w:t>FreeSurfer / FastSurfer</w:t>
+              <w:t>dwi-select log</w:t>
             </w:r>
           </w:p>
         </w:tc>
@@ -2476,7 +2670,51 @@
           </w:tcPr>
           <w:p>
             <w:r>
-              <w:t>`freesurfer/sub-XXX/mri/aparc+aseg.mgz` and `rawavg.mgz` exist</w:t>
+              <w:t>Keeps b1000 DWI + IntendedFor fmaps; excludes acq-rs</w:t>
+            </w:r>
+          </w:p>
+        </w:tc>
+      </w:tr>
+      <w:tr>
+        <w:tc>
+          <w:tcPr>
+            <w:tcW w:type="dxa" w:w="4320"/>
+          </w:tcPr>
+          <w:p>
+            <w:r>
+              <w:t>QSIPrep</w:t>
+            </w:r>
+          </w:p>
+        </w:tc>
+        <w:tc>
+          <w:tcPr>
+            <w:tcW w:type="dxa" w:w="4320"/>
+          </w:tcPr>
+          <w:p>
+            <w:r>
+              <w:t>Measured SDC when fmaps in filter; exit 0</w:t>
+            </w:r>
+          </w:p>
+        </w:tc>
+      </w:tr>
+      <w:tr>
+        <w:tc>
+          <w:tcPr>
+            <w:tcW w:type="dxa" w:w="4320"/>
+          </w:tcPr>
+          <w:p>
+            <w:r>
+              <w:t>FreeSurfer</w:t>
+            </w:r>
+          </w:p>
+        </w:tc>
+        <w:tc>
+          <w:tcPr>
+            <w:tcW w:type="dxa" w:w="4320"/>
+          </w:tcPr>
+          <w:p>
+            <w:r>
+              <w:t>`aparc+aseg.mgz`, `rawavg.mgz`, `recon-all.done`</w:t>
             </w:r>
           </w:p>
         </w:tc>
@@ -2498,7 +2736,7 @@
           </w:tcPr>
           <w:p>
             <w:r>
-              <w:t>Workflow completes; ~10 million streamlines</w:t>
+              <w:t>~10M streamlines; ACT-HSVS completes</w:t>
             </w:r>
           </w:p>
         </w:tc>
@@ -2510,7 +2748,7 @@
           </w:tcPr>
           <w:p>
             <w:r>
-              <w:t>DK log</w:t>
+              <w:t>Step 4 log</w:t>
             </w:r>
           </w:p>
         </w:tc>
@@ -2520,7 +2758,7 @@
           </w:tcPr>
           <w:p>
             <w:r>
-              <w:t>Reports three-hop warp: conformed → native → QSIPrep T1w (affine) → `dwiref`</w:t>
+              <w:t>Space chain: conformed → native → desc-preproc_T1w → dwiref</w:t>
             </w:r>
           </w:p>
         </w:tc>
@@ -2532,7 +2770,7 @@
           </w:tcPr>
           <w:p>
             <w:r>
-              <w:t>`dk_nodes.mrinfo.txt`</w:t>
+              <w:t>`nodes.mrinfo.txt`</w:t>
             </w:r>
           </w:p>
         </w:tc>
@@ -2542,7 +2780,7 @@
           </w:tcPr>
           <w:p>
             <w:r>
-              <w:t>Grid matches preprocessed DWI / `dwiref`</w:t>
+              <w:t>Grid matches dwiref (~2 mm)</w:t>
             </w:r>
           </w:p>
         </w:tc>
@@ -2554,7 +2792,7 @@
           </w:tcPr>
           <w:p>
             <w:r>
-              <w:t>`dk_connectome.csv`</w:t>
+              <w:t>`dkt_connectome.csv`</w:t>
             </w:r>
           </w:p>
         </w:tc>
@@ -2564,12 +2802,35 @@
           </w:tcPr>
           <w:p>
             <w:r>
-              <w:t>Few or no isolated DK nodes</w:t>
+              <w:t>78×78 symmetric; all ROIs populated (no empty rows)</w:t>
+            </w:r>
+          </w:p>
+        </w:tc>
+      </w:tr>
+      <w:tr>
+        <w:tc>
+          <w:tcPr>
+            <w:tcW w:type="dxa" w:w="4320"/>
+          </w:tcPr>
+          <w:p>
+            <w:r>
+              <w:t>`parcellation.json`</w:t>
+            </w:r>
+          </w:p>
+        </w:tc>
+        <w:tc>
+          <w:tcPr>
+            <w:tcW w:type="dxa" w:w="4320"/>
+          </w:tcPr>
+          <w:p>
+            <w:r>
+              <w:t>`empty_nodes: 0`, and `aparc_aseg` matches the requested atlas</w:t>
             </w:r>
           </w:p>
         </w:tc>
       </w:tr>
     </w:tbl>
+    <w:p/>
     <w:p/>
     <w:p>
       <w:pPr>
@@ -2581,18 +2842,87 @@
     </w:p>
     <w:p>
       <w:r>
-        <w:t>QSIPrep defines the tracking space. FreeSurfer defines anatomical labels. QSIRecon generates streamlines in QSIPrep T1w space. The DK step warps labels through native T1w, an empirical affine into desc-preproc_T1w, and a final resample onto dwiref, then assigns streamline endpoints with tck2connectome.</w:t>
+        <w:rPr>
+          <w:b/>
+        </w:rPr>
+        <w:t>QSIPrep</w:t>
+      </w:r>
+      <w:r>
+        <w:t xml:space="preserve"> (with </w:t>
+      </w:r>
+      <w:r>
+        <w:rPr>
+          <w:b/>
+        </w:rPr>
+        <w:t>dwi-select</w:t>
+      </w:r>
+      <w:r>
+        <w:t xml:space="preserve">) defines the tracking space and SDC path. </w:t>
+      </w:r>
+      <w:r>
+        <w:rPr>
+          <w:b/>
+        </w:rPr>
+        <w:t>FreeSurfer</w:t>
+      </w:r>
+      <w:r>
+        <w:t xml:space="preserve"> defines anatomical labels. </w:t>
+      </w:r>
+      <w:r>
+        <w:rPr>
+          <w:b/>
+        </w:rPr>
+        <w:t>QSIRecon</w:t>
+      </w:r>
+      <w:r>
+        <w:t xml:space="preserve"> generates streamlines in QSIPrep T1w space. The </w:t>
+      </w:r>
+      <w:r>
+        <w:rPr>
+          <w:b/>
+        </w:rPr>
+        <w:t>DK step</w:t>
+      </w:r>
+      <w:r>
+        <w:t xml:space="preserve"> warps labels through native T1w, an empirical affine into </w:t>
+      </w:r>
+      <w:r>
+        <w:rPr>
+          <w:rFonts w:ascii="Courier New" w:hAnsi="Courier New"/>
+        </w:rPr>
+        <w:t>desc-preproc_T1w</w:t>
+      </w:r>
+      <w:r>
+        <w:t xml:space="preserve">, and a final resample onto </w:t>
+      </w:r>
+      <w:r>
+        <w:rPr>
+          <w:rFonts w:ascii="Courier New" w:hAnsi="Courier New"/>
+        </w:rPr>
+        <w:t>dwiref</w:t>
+      </w:r>
+      <w:r>
+        <w:t xml:space="preserve">, then assigns streamline endpoints with </w:t>
+      </w:r>
+      <w:r>
+        <w:rPr>
+          <w:rFonts w:ascii="Courier New" w:hAnsi="Courier New"/>
+        </w:rPr>
+        <w:t>tck2connectome</w:t>
+      </w:r>
+      <w:r>
+        <w:t>.</w:t>
       </w:r>
     </w:p>
     <w:p>
       <w:r>
         <w:rPr>
-          <w:rFonts w:ascii="Consolas" w:hAnsi="Consolas"/>
+          <w:rFonts w:ascii="Courier New" w:hAnsi="Courier New"/>
           <w:sz w:val="18"/>
         </w:rPr>
         <w:t>Tractography space  = QSIPrep T1w / dwiref grid (~2 mm)</w:t>
         <w:br/>
-        <w:t>DK node space       = FreeSurfer labels → native T1w → desc-preproc_T1w → dwiref</w:t>
+        <w:t>DK node space       = FS labels → rawavg → desc-preproc_T1w → dwiref</w:t>
       </w:r>
     </w:p>
     <w:p>

</xml_diff>